<commit_message>
q9 answerd in docx
</commit_message>
<xml_diff>
--- a/assignment_3.docx
+++ b/assignment_3.docx
@@ -529,6 +529,7 @@
         <w:rPr>
           <w:b/>
           <w:bCs/>
+          <w:noProof/>
           <w:lang w:val="en-US"/>
         </w:rPr>
         <w:drawing>
@@ -644,6 +645,7 @@
       </w:pPr>
       <w:r>
         <w:rPr>
+          <w:noProof/>
           <w:color w:val="7F7F7F" w:themeColor="text1" w:themeTint="80"/>
           <w:lang w:val="en-US"/>
         </w:rPr>
@@ -720,6 +722,7 @@
         <w:rPr>
           <w:b/>
           <w:bCs/>
+          <w:noProof/>
           <w:lang w:val="en-US"/>
         </w:rPr>
         <w:lastRenderedPageBreak/>
@@ -786,14 +789,7 @@
           <w:color w:val="7F7F7F" w:themeColor="text1" w:themeTint="80"/>
           <w:lang w:val="en-US"/>
         </w:rPr>
-        <w:t xml:space="preserve">: </w:t>
-      </w:r>
-      <w:r>
-        <w:rPr>
-          <w:color w:val="7F7F7F" w:themeColor="text1" w:themeTint="80"/>
-          <w:lang w:val="en-US"/>
-        </w:rPr>
-        <w:t>Acceleration Data from Smartwatch during exercise</w:t>
+        <w:t>: Acceleration Data from Smartwatch during exercise</w:t>
       </w:r>
     </w:p>
     <w:p>
@@ -991,6 +987,7 @@
         <w:rPr>
           <w:b/>
           <w:bCs/>
+          <w:noProof/>
           <w:lang w:val="en-US"/>
         </w:rPr>
         <w:drawing>
@@ -1063,31 +1060,32 @@
           <w:color w:val="7F7F7F" w:themeColor="text1" w:themeTint="80"/>
           <w:lang w:val="en-US"/>
         </w:rPr>
-        <w:t>PPG containing only the exercise from Smartwatch</w:t>
-      </w:r>
+        <w:t xml:space="preserve">PPG containing only the exercise from Smartwatch (top) and ECG containing the same exercise from </w:t>
+      </w:r>
+      <w:proofErr w:type="spellStart"/>
       <w:r>
         <w:rPr>
           <w:color w:val="7F7F7F" w:themeColor="text1" w:themeTint="80"/>
           <w:lang w:val="en-US"/>
         </w:rPr>
-        <w:t xml:space="preserve"> (top) and ECG containing the same exercise from </w:t>
-      </w:r>
-      <w:proofErr w:type="spellStart"/>
+        <w:t>BioPac</w:t>
+      </w:r>
+      <w:proofErr w:type="spellEnd"/>
       <w:r>
         <w:rPr>
           <w:color w:val="7F7F7F" w:themeColor="text1" w:themeTint="80"/>
           <w:lang w:val="en-US"/>
         </w:rPr>
-        <w:t>BioPac</w:t>
-      </w:r>
-      <w:proofErr w:type="spellEnd"/>
-      <w:r>
+        <w:t xml:space="preserve"> (bottom)</w:t>
+      </w:r>
+    </w:p>
+    <w:p>
+      <w:pPr>
         <w:rPr>
           <w:color w:val="7F7F7F" w:themeColor="text1" w:themeTint="80"/>
           <w:lang w:val="en-US"/>
         </w:rPr>
-        <w:t xml:space="preserve"> (bottom)</w:t>
-      </w:r>
+      </w:pPr>
     </w:p>
     <w:p>
       <w:pPr>
@@ -1096,16 +1094,9 @@
           <w:lang w:val="en-US"/>
         </w:rPr>
       </w:pPr>
-    </w:p>
-    <w:p>
-      <w:pPr>
-        <w:rPr>
-          <w:color w:val="7F7F7F" w:themeColor="text1" w:themeTint="80"/>
-          <w:lang w:val="en-US"/>
-        </w:rPr>
-      </w:pPr>
-      <w:r>
-        <w:rPr>
+      <w:r>
+        <w:rPr>
+          <w:noProof/>
           <w:color w:val="7F7F7F" w:themeColor="text1" w:themeTint="80"/>
           <w:lang w:val="en-US"/>
         </w:rPr>
@@ -1159,49 +1150,36 @@
           <w:color w:val="7F7F7F" w:themeColor="text1" w:themeTint="80"/>
           <w:lang w:val="en-US"/>
         </w:rPr>
-        <w:t xml:space="preserve">Figure </w:t>
-      </w:r>
+        <w:t xml:space="preserve">Figure 5: PPG containing only the exercise from </w:t>
+      </w:r>
+      <w:proofErr w:type="spellStart"/>
       <w:r>
         <w:rPr>
           <w:color w:val="7F7F7F" w:themeColor="text1" w:themeTint="80"/>
           <w:lang w:val="en-US"/>
         </w:rPr>
-        <w:t>5</w:t>
-      </w:r>
-      <w:r>
+        <w:t>BioPac</w:t>
+      </w:r>
+      <w:proofErr w:type="spellEnd"/>
+    </w:p>
+    <w:p>
+      <w:pPr>
         <w:rPr>
           <w:color w:val="7F7F7F" w:themeColor="text1" w:themeTint="80"/>
           <w:lang w:val="en-US"/>
         </w:rPr>
-        <w:t xml:space="preserve">: PPG containing only the exercise from </w:t>
-      </w:r>
-      <w:proofErr w:type="spellStart"/>
-      <w:r>
+      </w:pPr>
+    </w:p>
+    <w:p>
+      <w:pPr>
         <w:rPr>
           <w:color w:val="7F7F7F" w:themeColor="text1" w:themeTint="80"/>
           <w:lang w:val="en-US"/>
         </w:rPr>
-        <w:t>BioPac</w:t>
-      </w:r>
-      <w:proofErr w:type="spellEnd"/>
-    </w:p>
-    <w:p>
-      <w:pPr>
-        <w:rPr>
-          <w:color w:val="7F7F7F" w:themeColor="text1" w:themeTint="80"/>
-          <w:lang w:val="en-US"/>
-        </w:rPr>
-      </w:pPr>
-    </w:p>
-    <w:p>
-      <w:pPr>
-        <w:rPr>
-          <w:color w:val="7F7F7F" w:themeColor="text1" w:themeTint="80"/>
-          <w:lang w:val="en-US"/>
-        </w:rPr>
-      </w:pPr>
-      <w:r>
-        <w:rPr>
+      </w:pPr>
+      <w:r>
+        <w:rPr>
+          <w:noProof/>
           <w:color w:val="7F7F7F" w:themeColor="text1" w:themeTint="80"/>
           <w:lang w:val="en-US"/>
         </w:rPr>
@@ -1246,21 +1224,7 @@
           <w:color w:val="7F7F7F" w:themeColor="text1" w:themeTint="80"/>
           <w:lang w:val="en-US"/>
         </w:rPr>
-        <w:t xml:space="preserve">Figure </w:t>
-      </w:r>
-      <w:r>
-        <w:rPr>
-          <w:color w:val="7F7F7F" w:themeColor="text1" w:themeTint="80"/>
-          <w:lang w:val="en-US"/>
-        </w:rPr>
-        <w:t>6</w:t>
-      </w:r>
-      <w:r>
-        <w:rPr>
-          <w:color w:val="7F7F7F" w:themeColor="text1" w:themeTint="80"/>
-          <w:lang w:val="en-US"/>
-        </w:rPr>
-        <w:t>: Acceleration Data from Smartwatch during exercise</w:t>
+        <w:t>Figure 6: Acceleration Data from Smartwatch during exercise</w:t>
       </w:r>
     </w:p>
     <w:p>
@@ -1547,6 +1511,7 @@
         <w:rPr>
           <w:b/>
           <w:bCs/>
+          <w:noProof/>
           <w:lang w:val="en-US"/>
         </w:rPr>
         <w:lastRenderedPageBreak/>
@@ -1599,70 +1564,50 @@
           <w:color w:val="7F7F7F" w:themeColor="text1" w:themeTint="80"/>
           <w:lang w:val="en-US"/>
         </w:rPr>
-        <w:t xml:space="preserve">Figure </w:t>
+        <w:t>Figure 7: R-Peak Detection that worked well</w:t>
       </w:r>
       <w:r>
         <w:rPr>
           <w:color w:val="7F7F7F" w:themeColor="text1" w:themeTint="80"/>
           <w:lang w:val="en-US"/>
         </w:rPr>
-        <w:t>7</w:t>
-      </w:r>
+        <w:t xml:space="preserve"> on </w:t>
+      </w:r>
+      <w:proofErr w:type="spellStart"/>
       <w:r>
         <w:rPr>
           <w:color w:val="7F7F7F" w:themeColor="text1" w:themeTint="80"/>
           <w:lang w:val="en-US"/>
         </w:rPr>
-        <w:t xml:space="preserve">: </w:t>
-      </w:r>
+        <w:t>BioPac</w:t>
+      </w:r>
+      <w:proofErr w:type="spellEnd"/>
       <w:r>
         <w:rPr>
           <w:color w:val="7F7F7F" w:themeColor="text1" w:themeTint="80"/>
           <w:lang w:val="en-US"/>
         </w:rPr>
-        <w:t>R-Peak Detection that worked well</w:t>
-      </w:r>
-      <w:r>
+        <w:t xml:space="preserve"> ECG</w:t>
+      </w:r>
+    </w:p>
+    <w:p>
+      <w:pPr>
         <w:rPr>
           <w:color w:val="7F7F7F" w:themeColor="text1" w:themeTint="80"/>
           <w:lang w:val="en-US"/>
         </w:rPr>
-        <w:t xml:space="preserve"> on </w:t>
-      </w:r>
-      <w:proofErr w:type="spellStart"/>
-      <w:r>
+      </w:pPr>
+    </w:p>
+    <w:p>
+      <w:pPr>
         <w:rPr>
           <w:color w:val="7F7F7F" w:themeColor="text1" w:themeTint="80"/>
           <w:lang w:val="en-US"/>
         </w:rPr>
-        <w:t>BioPac</w:t>
-      </w:r>
-      <w:proofErr w:type="spellEnd"/>
-      <w:r>
-        <w:rPr>
-          <w:color w:val="7F7F7F" w:themeColor="text1" w:themeTint="80"/>
-          <w:lang w:val="en-US"/>
-        </w:rPr>
-        <w:t xml:space="preserve"> ECG</w:t>
-      </w:r>
-    </w:p>
-    <w:p>
-      <w:pPr>
-        <w:rPr>
-          <w:color w:val="7F7F7F" w:themeColor="text1" w:themeTint="80"/>
-          <w:lang w:val="en-US"/>
-        </w:rPr>
-      </w:pPr>
-    </w:p>
-    <w:p>
-      <w:pPr>
-        <w:rPr>
-          <w:color w:val="7F7F7F" w:themeColor="text1" w:themeTint="80"/>
-          <w:lang w:val="en-US"/>
-        </w:rPr>
-      </w:pPr>
-      <w:r>
-        <w:rPr>
+      </w:pPr>
+      <w:r>
+        <w:rPr>
+          <w:noProof/>
           <w:color w:val="7F7F7F" w:themeColor="text1" w:themeTint="80"/>
           <w:lang w:val="en-US"/>
         </w:rPr>
@@ -1715,70 +1660,50 @@
           <w:color w:val="7F7F7F" w:themeColor="text1" w:themeTint="80"/>
           <w:lang w:val="en-US"/>
         </w:rPr>
-        <w:t xml:space="preserve">Figure </w:t>
+        <w:t xml:space="preserve">Figure 8: R-Peak Detection that worked </w:t>
       </w:r>
       <w:r>
         <w:rPr>
           <w:color w:val="7F7F7F" w:themeColor="text1" w:themeTint="80"/>
           <w:lang w:val="en-US"/>
         </w:rPr>
-        <w:t>8</w:t>
-      </w:r>
+        <w:t xml:space="preserve">poorly on </w:t>
+      </w:r>
+      <w:proofErr w:type="spellStart"/>
       <w:r>
         <w:rPr>
           <w:color w:val="7F7F7F" w:themeColor="text1" w:themeTint="80"/>
           <w:lang w:val="en-US"/>
         </w:rPr>
-        <w:t xml:space="preserve">: R-Peak Detection that worked </w:t>
-      </w:r>
+        <w:t>BioPac</w:t>
+      </w:r>
+      <w:proofErr w:type="spellEnd"/>
       <w:r>
         <w:rPr>
           <w:color w:val="7F7F7F" w:themeColor="text1" w:themeTint="80"/>
           <w:lang w:val="en-US"/>
         </w:rPr>
-        <w:t xml:space="preserve">poorly </w:t>
-      </w:r>
-      <w:r>
+        <w:t xml:space="preserve"> ECG</w:t>
+      </w:r>
+    </w:p>
+    <w:p>
+      <w:pPr>
         <w:rPr>
           <w:color w:val="7F7F7F" w:themeColor="text1" w:themeTint="80"/>
           <w:lang w:val="en-US"/>
         </w:rPr>
-        <w:t xml:space="preserve">on </w:t>
-      </w:r>
-      <w:proofErr w:type="spellStart"/>
-      <w:r>
+      </w:pPr>
+    </w:p>
+    <w:p>
+      <w:pPr>
         <w:rPr>
           <w:color w:val="7F7F7F" w:themeColor="text1" w:themeTint="80"/>
           <w:lang w:val="en-US"/>
         </w:rPr>
-        <w:t>BioPac</w:t>
-      </w:r>
-      <w:proofErr w:type="spellEnd"/>
-      <w:r>
-        <w:rPr>
-          <w:color w:val="7F7F7F" w:themeColor="text1" w:themeTint="80"/>
-          <w:lang w:val="en-US"/>
-        </w:rPr>
-        <w:t xml:space="preserve"> ECG</w:t>
-      </w:r>
-    </w:p>
-    <w:p>
-      <w:pPr>
-        <w:rPr>
-          <w:color w:val="7F7F7F" w:themeColor="text1" w:themeTint="80"/>
-          <w:lang w:val="en-US"/>
-        </w:rPr>
-      </w:pPr>
-    </w:p>
-    <w:p>
-      <w:pPr>
-        <w:rPr>
-          <w:color w:val="7F7F7F" w:themeColor="text1" w:themeTint="80"/>
-          <w:lang w:val="en-US"/>
-        </w:rPr>
-      </w:pPr>
-      <w:r>
-        <w:rPr>
+      </w:pPr>
+      <w:r>
+        <w:rPr>
+          <w:noProof/>
           <w:color w:val="7F7F7F" w:themeColor="text1" w:themeTint="80"/>
           <w:lang w:val="en-US"/>
         </w:rPr>
@@ -1831,56 +1756,56 @@
           <w:color w:val="7F7F7F" w:themeColor="text1" w:themeTint="80"/>
           <w:lang w:val="en-US"/>
         </w:rPr>
-        <w:t xml:space="preserve">Figure </w:t>
+        <w:t xml:space="preserve">Figure 9: </w:t>
       </w:r>
       <w:r>
         <w:rPr>
           <w:color w:val="7F7F7F" w:themeColor="text1" w:themeTint="80"/>
           <w:lang w:val="en-US"/>
         </w:rPr>
-        <w:t>9</w:t>
+        <w:t>Derived h</w:t>
       </w:r>
       <w:r>
         <w:rPr>
           <w:color w:val="7F7F7F" w:themeColor="text1" w:themeTint="80"/>
           <w:lang w:val="en-US"/>
         </w:rPr>
-        <w:t xml:space="preserve">: </w:t>
-      </w:r>
-      <w:r>
+        <w:t>eart rate during the exercise: instant heart rate (blue) and smoothed heart rate (orange)</w:t>
+      </w:r>
+    </w:p>
+    <w:p>
+      <w:pPr>
         <w:rPr>
           <w:color w:val="7F7F7F" w:themeColor="text1" w:themeTint="80"/>
           <w:lang w:val="en-US"/>
         </w:rPr>
-        <w:t>Derived h</w:t>
-      </w:r>
-      <w:r>
-        <w:rPr>
-          <w:color w:val="7F7F7F" w:themeColor="text1" w:themeTint="80"/>
-          <w:lang w:val="en-US"/>
-        </w:rPr>
-        <w:t>eart rate during the exercise: instant heart rate (blue) and smoothed heart rate (orange)</w:t>
-      </w:r>
-    </w:p>
-    <w:p>
-      <w:pPr>
-        <w:rPr>
-          <w:color w:val="7F7F7F" w:themeColor="text1" w:themeTint="80"/>
-          <w:lang w:val="en-US"/>
-        </w:rPr>
-      </w:pPr>
-    </w:p>
-    <w:p>
-      <w:pPr>
-        <w:rPr>
-          <w:lang w:val="en-US"/>
-        </w:rPr>
-      </w:pPr>
-      <w:r>
-        <w:rPr>
-          <w:lang w:val="en-US"/>
-        </w:rPr>
-        <w:t xml:space="preserve">The instant heart rate shows extremely sharp peaks and declines that realistically do not give meaningful information about the heart rate. For instance, at the beginning of the measurement, before the start of the exercise (during rest), the instant heart rate hits almost 200 for an instance, and drops to 30 just a few heart beats later. This is not in any way descriptive of the heart rate we want to analyze, as those peaks and drops are most likely artefacts of measuring intervals or slight irregularities in the heart rate. If two heart beats are slightly further apart than </w:t>
+      </w:pPr>
+    </w:p>
+    <w:p>
+      <w:pPr>
+        <w:rPr>
+          <w:lang w:val="en-US"/>
+        </w:rPr>
+      </w:pPr>
+      <w:r>
+        <w:rPr>
+          <w:lang w:val="en-US"/>
+        </w:rPr>
+        <w:t xml:space="preserve">The instant heart rate shows extremely sharp peaks and declines that realistically do not give meaningful information about the heart rate. For instance, at the beginning of the measurement, before the start of the exercise (during rest), the instant heart rate hits almost 200 for an </w:t>
+      </w:r>
+      <w:proofErr w:type="gramStart"/>
+      <w:r>
+        <w:rPr>
+          <w:lang w:val="en-US"/>
+        </w:rPr>
+        <w:t>instance, and</w:t>
+      </w:r>
+      <w:proofErr w:type="gramEnd"/>
+      <w:r>
+        <w:rPr>
+          <w:lang w:val="en-US"/>
+        </w:rPr>
+        <w:t xml:space="preserve"> drops to 30 just a few heart beats later. This is not in any way descriptive of the heart rate we want to analyze, as those peaks and drops are most likely artefacts of measuring intervals or slight irregularities in the heart rate. If two heart beats are slightly further apart than </w:t>
       </w:r>
       <w:r>
         <w:rPr>
@@ -2158,6 +2083,7 @@
         <w:rPr>
           <w:b/>
           <w:bCs/>
+          <w:noProof/>
           <w:lang w:val="en-US"/>
         </w:rPr>
         <w:drawing>
@@ -2209,36 +2135,22 @@
           <w:color w:val="7F7F7F" w:themeColor="text1" w:themeTint="80"/>
           <w:lang w:val="en-US"/>
         </w:rPr>
-        <w:t xml:space="preserve">Figure </w:t>
-      </w:r>
+        <w:t xml:space="preserve">Figure 10: R-Peak Detection that worked well on </w:t>
+      </w:r>
+      <w:proofErr w:type="spellStart"/>
       <w:r>
         <w:rPr>
           <w:color w:val="7F7F7F" w:themeColor="text1" w:themeTint="80"/>
           <w:lang w:val="en-US"/>
         </w:rPr>
-        <w:t>10</w:t>
-      </w:r>
+        <w:t>BioPac</w:t>
+      </w:r>
+      <w:proofErr w:type="spellEnd"/>
       <w:r>
         <w:rPr>
           <w:color w:val="7F7F7F" w:themeColor="text1" w:themeTint="80"/>
           <w:lang w:val="en-US"/>
         </w:rPr>
-        <w:t xml:space="preserve">: R-Peak Detection that worked well on </w:t>
-      </w:r>
-      <w:proofErr w:type="spellStart"/>
-      <w:r>
-        <w:rPr>
-          <w:color w:val="7F7F7F" w:themeColor="text1" w:themeTint="80"/>
-          <w:lang w:val="en-US"/>
-        </w:rPr>
-        <w:t>BioPac</w:t>
-      </w:r>
-      <w:proofErr w:type="spellEnd"/>
-      <w:r>
-        <w:rPr>
-          <w:color w:val="7F7F7F" w:themeColor="text1" w:themeTint="80"/>
-          <w:lang w:val="en-US"/>
-        </w:rPr>
         <w:t xml:space="preserve"> ECG</w:t>
       </w:r>
     </w:p>
@@ -2263,6 +2175,7 @@
         <w:rPr>
           <w:b/>
           <w:bCs/>
+          <w:noProof/>
           <w:lang w:val="en-US"/>
         </w:rPr>
         <w:drawing>
@@ -2314,50 +2227,22 @@
           <w:color w:val="7F7F7F" w:themeColor="text1" w:themeTint="80"/>
           <w:lang w:val="en-US"/>
         </w:rPr>
-        <w:t xml:space="preserve">Figure </w:t>
-      </w:r>
+        <w:t xml:space="preserve">Figure 11: R-Peak Detection that worked poorly on </w:t>
+      </w:r>
+      <w:proofErr w:type="spellStart"/>
       <w:r>
         <w:rPr>
           <w:color w:val="7F7F7F" w:themeColor="text1" w:themeTint="80"/>
           <w:lang w:val="en-US"/>
         </w:rPr>
-        <w:t>11</w:t>
-      </w:r>
+        <w:t>BioPac</w:t>
+      </w:r>
+      <w:proofErr w:type="spellEnd"/>
       <w:r>
         <w:rPr>
           <w:color w:val="7F7F7F" w:themeColor="text1" w:themeTint="80"/>
           <w:lang w:val="en-US"/>
         </w:rPr>
-        <w:t xml:space="preserve">: R-Peak Detection that worked </w:t>
-      </w:r>
-      <w:r>
-        <w:rPr>
-          <w:color w:val="7F7F7F" w:themeColor="text1" w:themeTint="80"/>
-          <w:lang w:val="en-US"/>
-        </w:rPr>
-        <w:t>poorly</w:t>
-      </w:r>
-      <w:r>
-        <w:rPr>
-          <w:color w:val="7F7F7F" w:themeColor="text1" w:themeTint="80"/>
-          <w:lang w:val="en-US"/>
-        </w:rPr>
-        <w:t xml:space="preserve"> on </w:t>
-      </w:r>
-      <w:proofErr w:type="spellStart"/>
-      <w:r>
-        <w:rPr>
-          <w:color w:val="7F7F7F" w:themeColor="text1" w:themeTint="80"/>
-          <w:lang w:val="en-US"/>
-        </w:rPr>
-        <w:t>BioPac</w:t>
-      </w:r>
-      <w:proofErr w:type="spellEnd"/>
-      <w:r>
-        <w:rPr>
-          <w:color w:val="7F7F7F" w:themeColor="text1" w:themeTint="80"/>
-          <w:lang w:val="en-US"/>
-        </w:rPr>
         <w:t xml:space="preserve"> ECG</w:t>
       </w:r>
     </w:p>
@@ -2382,6 +2267,7 @@
         <w:rPr>
           <w:b/>
           <w:bCs/>
+          <w:noProof/>
           <w:lang w:val="en-US"/>
         </w:rPr>
         <w:lastRenderedPageBreak/>
@@ -2434,48 +2320,34 @@
           <w:color w:val="7F7F7F" w:themeColor="text1" w:themeTint="80"/>
           <w:lang w:val="en-US"/>
         </w:rPr>
-        <w:t xml:space="preserve">Figure </w:t>
+        <w:t xml:space="preserve">Figure 12: </w:t>
       </w:r>
       <w:r>
         <w:rPr>
           <w:color w:val="7F7F7F" w:themeColor="text1" w:themeTint="80"/>
           <w:lang w:val="en-US"/>
         </w:rPr>
-        <w:t>12</w:t>
+        <w:t>Derived h</w:t>
       </w:r>
       <w:r>
         <w:rPr>
           <w:color w:val="7F7F7F" w:themeColor="text1" w:themeTint="80"/>
           <w:lang w:val="en-US"/>
         </w:rPr>
-        <w:t xml:space="preserve">: </w:t>
+        <w:t>eart rate</w:t>
       </w:r>
       <w:r>
         <w:rPr>
           <w:color w:val="7F7F7F" w:themeColor="text1" w:themeTint="80"/>
           <w:lang w:val="en-US"/>
         </w:rPr>
-        <w:t>Derived h</w:t>
+        <w:t xml:space="preserve"> </w:t>
       </w:r>
       <w:r>
         <w:rPr>
           <w:color w:val="7F7F7F" w:themeColor="text1" w:themeTint="80"/>
           <w:lang w:val="en-US"/>
         </w:rPr>
-        <w:t>eart rate</w:t>
-      </w:r>
-      <w:r>
-        <w:rPr>
-          <w:color w:val="7F7F7F" w:themeColor="text1" w:themeTint="80"/>
-          <w:lang w:val="en-US"/>
-        </w:rPr>
-        <w:t xml:space="preserve"> </w:t>
-      </w:r>
-      <w:r>
-        <w:rPr>
-          <w:color w:val="7F7F7F" w:themeColor="text1" w:themeTint="80"/>
-          <w:lang w:val="en-US"/>
-        </w:rPr>
         <w:t>during the exercise: instant heart rate (blue) and smoothed heart rate (orange)</w:t>
       </w:r>
     </w:p>
@@ -2496,19 +2368,7 @@
         <w:rPr>
           <w:lang w:val="en-US"/>
         </w:rPr>
-        <w:t xml:space="preserve">The smoothed heart rate is more resistant to irregularities and therefore much more readable. It is much easier to track where the subject was doing exercises and where the subject was resting in the smoothed heart rate. Notably, periods of higher smoothed heart rates largely overlap with more sharp spikes and drops </w:t>
-      </w:r>
-      <w:r>
-        <w:rPr>
-          <w:lang w:val="en-US"/>
-        </w:rPr>
-        <w:t>in the instant heart rate</w:t>
-      </w:r>
-      <w:r>
-        <w:rPr>
-          <w:lang w:val="en-US"/>
-        </w:rPr>
-        <w:t xml:space="preserve">. The instant heart rate appears more irregular when the subjects heart beast faster. </w:t>
+        <w:t xml:space="preserve">The smoothed heart rate is more resistant to irregularities and therefore much more readable. It is much easier to track where the subject was doing exercises and where the subject was resting in the smoothed heart rate. Notably, periods of higher smoothed heart rates largely overlap with more sharp spikes and drops in the instant heart rate. The instant heart rate appears more irregular when the subjects heart beast faster. </w:t>
       </w:r>
     </w:p>
     <w:p>
@@ -2776,6 +2636,7 @@
         <w:rPr>
           <w:b/>
           <w:bCs/>
+          <w:noProof/>
           <w:lang w:val="en-US"/>
         </w:rPr>
         <w:drawing>
@@ -2827,65 +2688,31 @@
           <w:color w:val="7F7F7F" w:themeColor="text1" w:themeTint="80"/>
           <w:lang w:val="en-US"/>
         </w:rPr>
-        <w:t>Figure 1</w:t>
-      </w:r>
-      <w:r>
-        <w:rPr>
-          <w:color w:val="7F7F7F" w:themeColor="text1" w:themeTint="80"/>
-          <w:lang w:val="en-US"/>
-        </w:rPr>
-        <w:t>3</w:t>
-      </w:r>
-      <w:r>
-        <w:rPr>
-          <w:color w:val="7F7F7F" w:themeColor="text1" w:themeTint="80"/>
-          <w:lang w:val="en-US"/>
-        </w:rPr>
-        <w:t xml:space="preserve">: R-Peak Detection that worked well on </w:t>
-      </w:r>
-      <w:r>
-        <w:rPr>
-          <w:color w:val="7F7F7F" w:themeColor="text1" w:themeTint="80"/>
-          <w:lang w:val="en-US"/>
-        </w:rPr>
-        <w:t>Smartwatch</w:t>
-      </w:r>
-      <w:r>
-        <w:rPr>
-          <w:color w:val="7F7F7F" w:themeColor="text1" w:themeTint="80"/>
-          <w:lang w:val="en-US"/>
-        </w:rPr>
-        <w:t xml:space="preserve"> </w:t>
-      </w:r>
-      <w:r>
-        <w:rPr>
-          <w:color w:val="7F7F7F" w:themeColor="text1" w:themeTint="80"/>
-          <w:lang w:val="en-US"/>
-        </w:rPr>
-        <w:t>PPG</w:t>
-      </w:r>
-    </w:p>
-    <w:p>
-      <w:pPr>
-        <w:rPr>
-          <w:b/>
-          <w:bCs/>
-          <w:lang w:val="en-US"/>
-        </w:rPr>
-      </w:pPr>
-    </w:p>
-    <w:p>
-      <w:pPr>
-        <w:rPr>
-          <w:b/>
-          <w:bCs/>
-          <w:lang w:val="en-US"/>
-        </w:rPr>
-      </w:pPr>
-      <w:r>
-        <w:rPr>
-          <w:b/>
-          <w:bCs/>
+        <w:t>Figure 13: R-Peak Detection that worked well on Smartwatch PPG</w:t>
+      </w:r>
+    </w:p>
+    <w:p>
+      <w:pPr>
+        <w:rPr>
+          <w:b/>
+          <w:bCs/>
+          <w:lang w:val="en-US"/>
+        </w:rPr>
+      </w:pPr>
+    </w:p>
+    <w:p>
+      <w:pPr>
+        <w:rPr>
+          <w:b/>
+          <w:bCs/>
+          <w:lang w:val="en-US"/>
+        </w:rPr>
+      </w:pPr>
+      <w:r>
+        <w:rPr>
+          <w:b/>
+          <w:bCs/>
+          <w:noProof/>
           <w:lang w:val="en-US"/>
         </w:rPr>
         <w:lastRenderedPageBreak/>
@@ -2938,79 +2765,31 @@
           <w:color w:val="7F7F7F" w:themeColor="text1" w:themeTint="80"/>
           <w:lang w:val="en-US"/>
         </w:rPr>
-        <w:t>Figure 1</w:t>
-      </w:r>
-      <w:r>
-        <w:rPr>
-          <w:color w:val="7F7F7F" w:themeColor="text1" w:themeTint="80"/>
-          <w:lang w:val="en-US"/>
-        </w:rPr>
-        <w:t>4</w:t>
-      </w:r>
-      <w:r>
-        <w:rPr>
-          <w:color w:val="7F7F7F" w:themeColor="text1" w:themeTint="80"/>
-          <w:lang w:val="en-US"/>
-        </w:rPr>
-        <w:t xml:space="preserve">: R-Peak Detection that worked </w:t>
-      </w:r>
-      <w:r>
-        <w:rPr>
-          <w:color w:val="7F7F7F" w:themeColor="text1" w:themeTint="80"/>
-          <w:lang w:val="en-US"/>
-        </w:rPr>
-        <w:t>poorly</w:t>
-      </w:r>
-      <w:r>
-        <w:rPr>
-          <w:color w:val="7F7F7F" w:themeColor="text1" w:themeTint="80"/>
-          <w:lang w:val="en-US"/>
-        </w:rPr>
-        <w:t xml:space="preserve"> on</w:t>
-      </w:r>
-      <w:r>
-        <w:rPr>
-          <w:color w:val="7F7F7F" w:themeColor="text1" w:themeTint="80"/>
-          <w:lang w:val="en-US"/>
-        </w:rPr>
-        <w:t xml:space="preserve"> Smartwatch</w:t>
-      </w:r>
-      <w:r>
-        <w:rPr>
-          <w:color w:val="7F7F7F" w:themeColor="text1" w:themeTint="80"/>
-          <w:lang w:val="en-US"/>
-        </w:rPr>
-        <w:t xml:space="preserve"> </w:t>
-      </w:r>
-      <w:r>
-        <w:rPr>
-          <w:color w:val="7F7F7F" w:themeColor="text1" w:themeTint="80"/>
-          <w:lang w:val="en-US"/>
-        </w:rPr>
-        <w:t>PPG</w:t>
-      </w:r>
-    </w:p>
-    <w:p>
-      <w:pPr>
-        <w:rPr>
-          <w:b/>
-          <w:bCs/>
-          <w:lang w:val="en-US"/>
-        </w:rPr>
-      </w:pPr>
-    </w:p>
-    <w:p>
-      <w:pPr>
-        <w:rPr>
-          <w:b/>
-          <w:bCs/>
-          <w:lang w:val="en-US"/>
-        </w:rPr>
-      </w:pPr>
-      <w:r>
-        <w:rPr>
-          <w:b/>
-          <w:bCs/>
+        <w:t>Figure 14: R-Peak Detection that worked poorly on Smartwatch PPG</w:t>
+      </w:r>
+    </w:p>
+    <w:p>
+      <w:pPr>
+        <w:rPr>
+          <w:b/>
+          <w:bCs/>
+          <w:lang w:val="en-US"/>
+        </w:rPr>
+      </w:pPr>
+    </w:p>
+    <w:p>
+      <w:pPr>
+        <w:rPr>
+          <w:b/>
+          <w:bCs/>
+          <w:lang w:val="en-US"/>
+        </w:rPr>
+      </w:pPr>
+      <w:r>
+        <w:rPr>
+          <w:b/>
+          <w:bCs/>
+          <w:noProof/>
           <w:lang w:val="en-US"/>
         </w:rPr>
         <w:drawing>
@@ -3062,56 +2841,42 @@
           <w:color w:val="7F7F7F" w:themeColor="text1" w:themeTint="80"/>
           <w:lang w:val="en-US"/>
         </w:rPr>
-        <w:t>Figure 1</w:t>
-      </w:r>
-      <w:r>
+        <w:t>Figure 15: Heart rate during the exercise: instant heart rate (blue) and smoothed heart rate (orange)</w:t>
+      </w:r>
+    </w:p>
+    <w:p>
+      <w:pPr>
         <w:rPr>
           <w:color w:val="7F7F7F" w:themeColor="text1" w:themeTint="80"/>
           <w:lang w:val="en-US"/>
         </w:rPr>
-        <w:t>5</w:t>
-      </w:r>
-      <w:r>
-        <w:rPr>
-          <w:color w:val="7F7F7F" w:themeColor="text1" w:themeTint="80"/>
-          <w:lang w:val="en-US"/>
-        </w:rPr>
-        <w:t>: Heart rate</w:t>
-      </w:r>
-      <w:r>
-        <w:rPr>
-          <w:color w:val="7F7F7F" w:themeColor="text1" w:themeTint="80"/>
-          <w:lang w:val="en-US"/>
-        </w:rPr>
-        <w:t xml:space="preserve"> </w:t>
-      </w:r>
-      <w:r>
-        <w:rPr>
-          <w:color w:val="7F7F7F" w:themeColor="text1" w:themeTint="80"/>
-          <w:lang w:val="en-US"/>
-        </w:rPr>
-        <w:t>during the exercise: instant heart rate (blue) and smoothed heart rate (orange)</w:t>
-      </w:r>
-    </w:p>
-    <w:p>
-      <w:pPr>
-        <w:rPr>
-          <w:color w:val="7F7F7F" w:themeColor="text1" w:themeTint="80"/>
-          <w:lang w:val="en-US"/>
-        </w:rPr>
-      </w:pPr>
-    </w:p>
-    <w:p>
-      <w:pPr>
-        <w:rPr>
-          <w:lang w:val="en-US"/>
-        </w:rPr>
-      </w:pPr>
-      <w:r>
-        <w:rPr>
-          <w:lang w:val="en-US"/>
-        </w:rPr>
-        <w:t xml:space="preserve">The differences are the same as for the previous two questions. However it is notable that the subjects heart rate does not appear to rise as much as it did during this exercise when the heart rate was derived from the </w:t>
+      </w:pPr>
+    </w:p>
+    <w:p>
+      <w:pPr>
+        <w:rPr>
+          <w:lang w:val="en-US"/>
+        </w:rPr>
+      </w:pPr>
+      <w:r>
+        <w:rPr>
+          <w:lang w:val="en-US"/>
+        </w:rPr>
+        <w:t xml:space="preserve">The differences are the same as for the previous two questions. </w:t>
+      </w:r>
+      <w:proofErr w:type="gramStart"/>
+      <w:r>
+        <w:rPr>
+          <w:lang w:val="en-US"/>
+        </w:rPr>
+        <w:t>However</w:t>
+      </w:r>
+      <w:proofErr w:type="gramEnd"/>
+      <w:r>
+        <w:rPr>
+          <w:lang w:val="en-US"/>
+        </w:rPr>
+        <w:t xml:space="preserve"> it is notable that the subjects heart rate does not appear to rise as much as it did during this exercise when the heart rate was derived from the </w:t>
       </w:r>
       <w:proofErr w:type="spellStart"/>
       <w:r>
@@ -3200,7 +2965,25 @@
           <w:bCs/>
           <w:lang w:val="en-US"/>
         </w:rPr>
-        <w:t>you are using in order to allocate the data to the correct tracks above. Use the neurokit2 toolbox</w:t>
+        <w:t xml:space="preserve">you are using </w:t>
+      </w:r>
+      <w:proofErr w:type="gramStart"/>
+      <w:r>
+        <w:rPr>
+          <w:b/>
+          <w:bCs/>
+          <w:lang w:val="en-US"/>
+        </w:rPr>
+        <w:t>in order to</w:t>
+      </w:r>
+      <w:proofErr w:type="gramEnd"/>
+      <w:r>
+        <w:rPr>
+          <w:b/>
+          <w:bCs/>
+          <w:lang w:val="en-US"/>
+        </w:rPr>
+        <w:t xml:space="preserve"> allocate the data to the correct tracks above. Use the neurokit2 toolbox</w:t>
       </w:r>
     </w:p>
     <w:p>
@@ -3491,7 +3274,25 @@
           <w:bCs/>
           <w:lang w:val="en-US"/>
         </w:rPr>
-        <w:t>this Question. Document which one you are using in order to allocate the data to the correct</w:t>
+        <w:t xml:space="preserve">this Question. Document which one you are using </w:t>
+      </w:r>
+      <w:proofErr w:type="gramStart"/>
+      <w:r>
+        <w:rPr>
+          <w:b/>
+          <w:bCs/>
+          <w:lang w:val="en-US"/>
+        </w:rPr>
+        <w:t>in order to</w:t>
+      </w:r>
+      <w:proofErr w:type="gramEnd"/>
+      <w:r>
+        <w:rPr>
+          <w:b/>
+          <w:bCs/>
+          <w:lang w:val="en-US"/>
+        </w:rPr>
+        <w:t xml:space="preserve"> allocate the data to the correct</w:t>
       </w:r>
     </w:p>
     <w:p>
@@ -3561,7 +3362,25 @@
           <w:bCs/>
           <w:lang w:val="en-US"/>
         </w:rPr>
-        <w:t>extraction. Before transforming the window into the frequency domain you should do some</w:t>
+        <w:t xml:space="preserve">extraction. Before transforming the window into the frequency </w:t>
+      </w:r>
+      <w:proofErr w:type="gramStart"/>
+      <w:r>
+        <w:rPr>
+          <w:b/>
+          <w:bCs/>
+          <w:lang w:val="en-US"/>
+        </w:rPr>
+        <w:t>domain</w:t>
+      </w:r>
+      <w:proofErr w:type="gramEnd"/>
+      <w:r>
+        <w:rPr>
+          <w:b/>
+          <w:bCs/>
+          <w:lang w:val="en-US"/>
+        </w:rPr>
+        <w:t xml:space="preserve"> you should do some</w:t>
       </w:r>
     </w:p>
     <w:p>
@@ -3613,7 +3432,25 @@
           <w:bCs/>
           <w:lang w:val="en-US"/>
         </w:rPr>
-        <w:t xml:space="preserve">for example </w:t>
+        <w:t xml:space="preserve">for </w:t>
+      </w:r>
+      <w:proofErr w:type="gramStart"/>
+      <w:r>
+        <w:rPr>
+          <w:b/>
+          <w:bCs/>
+          <w:lang w:val="en-US"/>
+        </w:rPr>
+        <w:t>example</w:t>
+      </w:r>
+      <w:proofErr w:type="gramEnd"/>
+      <w:r>
+        <w:rPr>
+          <w:b/>
+          <w:bCs/>
+          <w:lang w:val="en-US"/>
+        </w:rPr>
+        <w:t xml:space="preserve"> </w:t>
       </w:r>
       <w:proofErr w:type="spellStart"/>
       <w:r>
@@ -3804,7 +3641,25 @@
           <w:bCs/>
           <w:lang w:val="en-US"/>
         </w:rPr>
-        <w:t>smartwatch PPG HR with and without smoothing for all measurements (You have to do that</w:t>
+        <w:t xml:space="preserve">smartwatch PPG HR with and without smoothing for all measurements (You </w:t>
+      </w:r>
+      <w:proofErr w:type="gramStart"/>
+      <w:r>
+        <w:rPr>
+          <w:b/>
+          <w:bCs/>
+          <w:lang w:val="en-US"/>
+        </w:rPr>
+        <w:t>have to</w:t>
+      </w:r>
+      <w:proofErr w:type="gramEnd"/>
+      <w:r>
+        <w:rPr>
+          <w:b/>
+          <w:bCs/>
+          <w:lang w:val="en-US"/>
+        </w:rPr>
+        <w:t xml:space="preserve"> do that</w:t>
       </w:r>
     </w:p>
     <w:p>
@@ -4131,24 +3986,60 @@
           <w:bCs/>
           <w:lang w:val="en-US"/>
         </w:rPr>
-        <w:t>both smoothed and not smoothed heart rate and also for “Stairs” and “Workout” data (you can</w:t>
-      </w:r>
-    </w:p>
-    <w:p>
-      <w:pPr>
-        <w:rPr>
-          <w:b/>
-          <w:bCs/>
-          <w:lang w:val="en-US"/>
-        </w:rPr>
-      </w:pPr>
-      <w:r>
-        <w:rPr>
-          <w:b/>
-          <w:bCs/>
-          <w:lang w:val="en-US"/>
-        </w:rPr>
-        <w:t>choose one measurement, but document which one).</w:t>
+        <w:t xml:space="preserve">both smoothed and not smoothed heart rate </w:t>
+      </w:r>
+      <w:proofErr w:type="gramStart"/>
+      <w:r>
+        <w:rPr>
+          <w:b/>
+          <w:bCs/>
+          <w:lang w:val="en-US"/>
+        </w:rPr>
+        <w:t>and also</w:t>
+      </w:r>
+      <w:proofErr w:type="gramEnd"/>
+      <w:r>
+        <w:rPr>
+          <w:b/>
+          <w:bCs/>
+          <w:lang w:val="en-US"/>
+        </w:rPr>
+        <w:t xml:space="preserve"> for “Stairs” and “Workout” data (you can</w:t>
+      </w:r>
+    </w:p>
+    <w:p>
+      <w:pPr>
+        <w:rPr>
+          <w:b/>
+          <w:bCs/>
+          <w:lang w:val="en-US"/>
+        </w:rPr>
+      </w:pPr>
+      <w:r>
+        <w:rPr>
+          <w:b/>
+          <w:bCs/>
+          <w:lang w:val="en-US"/>
+        </w:rPr>
+        <w:t xml:space="preserve">choose one </w:t>
+      </w:r>
+      <w:proofErr w:type="gramStart"/>
+      <w:r>
+        <w:rPr>
+          <w:b/>
+          <w:bCs/>
+          <w:lang w:val="en-US"/>
+        </w:rPr>
+        <w:t>measurement, but</w:t>
+      </w:r>
+      <w:proofErr w:type="gramEnd"/>
+      <w:r>
+        <w:rPr>
+          <w:b/>
+          <w:bCs/>
+          <w:lang w:val="en-US"/>
+        </w:rPr>
+        <w:t xml:space="preserve"> document which one).</w:t>
       </w:r>
     </w:p>
     <w:p>
@@ -4182,41 +4073,95 @@
           <w:bCs/>
           <w:lang w:val="en-US"/>
         </w:rPr>
-        <w:t>smoothed and not smoothed heart rate and also for “Stairs” and “Workout” data (you can</w:t>
-      </w:r>
-    </w:p>
-    <w:p>
-      <w:pPr>
-        <w:rPr>
-          <w:b/>
-          <w:bCs/>
-          <w:lang w:val="en-US"/>
-        </w:rPr>
-      </w:pPr>
-      <w:r>
-        <w:rPr>
-          <w:b/>
-          <w:bCs/>
-          <w:lang w:val="en-US"/>
-        </w:rPr>
-        <w:t>choose one measurement, but document which one).</w:t>
-      </w:r>
-    </w:p>
-    <w:p>
-      <w:pPr>
-        <w:rPr>
-          <w:b/>
-          <w:bCs/>
-          <w:lang w:val="en-US"/>
-        </w:rPr>
-      </w:pPr>
-      <w:r>
-        <w:rPr>
-          <w:b/>
-          <w:bCs/>
-          <w:lang w:val="en-US"/>
-        </w:rPr>
-        <w:t>Also do a Bland Altmann plot on the frequency based heart rate extraction.</w:t>
+        <w:t xml:space="preserve">smoothed and not smoothed heart rate </w:t>
+      </w:r>
+      <w:proofErr w:type="gramStart"/>
+      <w:r>
+        <w:rPr>
+          <w:b/>
+          <w:bCs/>
+          <w:lang w:val="en-US"/>
+        </w:rPr>
+        <w:t>and also</w:t>
+      </w:r>
+      <w:proofErr w:type="gramEnd"/>
+      <w:r>
+        <w:rPr>
+          <w:b/>
+          <w:bCs/>
+          <w:lang w:val="en-US"/>
+        </w:rPr>
+        <w:t xml:space="preserve"> for “Stairs” and “Workout” data (you can</w:t>
+      </w:r>
+    </w:p>
+    <w:p>
+      <w:pPr>
+        <w:rPr>
+          <w:b/>
+          <w:bCs/>
+          <w:lang w:val="en-US"/>
+        </w:rPr>
+      </w:pPr>
+      <w:r>
+        <w:rPr>
+          <w:b/>
+          <w:bCs/>
+          <w:lang w:val="en-US"/>
+        </w:rPr>
+        <w:t xml:space="preserve">choose one </w:t>
+      </w:r>
+      <w:proofErr w:type="gramStart"/>
+      <w:r>
+        <w:rPr>
+          <w:b/>
+          <w:bCs/>
+          <w:lang w:val="en-US"/>
+        </w:rPr>
+        <w:t>measurement, but</w:t>
+      </w:r>
+      <w:proofErr w:type="gramEnd"/>
+      <w:r>
+        <w:rPr>
+          <w:b/>
+          <w:bCs/>
+          <w:lang w:val="en-US"/>
+        </w:rPr>
+        <w:t xml:space="preserve"> document which one).</w:t>
+      </w:r>
+    </w:p>
+    <w:p>
+      <w:pPr>
+        <w:rPr>
+          <w:b/>
+          <w:bCs/>
+          <w:lang w:val="en-US"/>
+        </w:rPr>
+      </w:pPr>
+      <w:r>
+        <w:rPr>
+          <w:b/>
+          <w:bCs/>
+          <w:lang w:val="en-US"/>
+        </w:rPr>
+        <w:t xml:space="preserve">Also do a Bland Altmann plot on the </w:t>
+      </w:r>
+      <w:proofErr w:type="gramStart"/>
+      <w:r>
+        <w:rPr>
+          <w:b/>
+          <w:bCs/>
+          <w:lang w:val="en-US"/>
+        </w:rPr>
+        <w:t>frequency based</w:t>
+      </w:r>
+      <w:proofErr w:type="gramEnd"/>
+      <w:r>
+        <w:rPr>
+          <w:b/>
+          <w:bCs/>
+          <w:lang w:val="en-US"/>
+        </w:rPr>
+        <w:t xml:space="preserve"> heart rate extraction.</w:t>
       </w:r>
     </w:p>
     <w:p>
@@ -4281,21 +4226,574 @@
     </w:p>
     <w:p>
       <w:pPr>
-        <w:rPr>
-          <w:b/>
-          <w:bCs/>
-          <w:color w:val="C00000"/>
-          <w:lang w:val="en-US"/>
-        </w:rPr>
-      </w:pPr>
-      <w:r>
-        <w:rPr>
-          <w:b/>
-          <w:bCs/>
-          <w:color w:val="C00000"/>
-          <w:lang w:val="en-US"/>
-        </w:rPr>
-        <w:t>TODO: Everything</w:t>
+        <w:pStyle w:val="ListParagraph"/>
+        <w:numPr>
+          <w:ilvl w:val="0"/>
+          <w:numId w:val="11"/>
+        </w:numPr>
+        <w:rPr>
+          <w:lang w:val="en-US"/>
+        </w:rPr>
+      </w:pPr>
+      <w:r>
+        <w:rPr>
+          <w:lang w:val="en-US"/>
+        </w:rPr>
+        <w:t>A Bland-Altman plot is a method to compare two measurement techniques by plotting the difference between the methods against their mean. It highlights bias (</w:t>
+      </w:r>
+      <w:r>
+        <w:rPr>
+          <w:lang w:val="en-US"/>
+        </w:rPr>
+        <w:t>mean</w:t>
+      </w:r>
+      <w:r>
+        <w:rPr>
+          <w:lang w:val="en-US"/>
+        </w:rPr>
+        <w:t xml:space="preserve"> difference), limits of agreement</w:t>
+      </w:r>
+      <w:r>
+        <w:rPr>
+          <w:lang w:val="en-US"/>
+        </w:rPr>
+        <w:t>,</w:t>
+      </w:r>
+      <w:r>
+        <w:rPr>
+          <w:lang w:val="en-US"/>
+        </w:rPr>
+        <w:t xml:space="preserve"> and potential trends in measurement error across the measurement range. In the </w:t>
+      </w:r>
+      <w:proofErr w:type="spellStart"/>
+      <w:r>
+        <w:rPr>
+          <w:lang w:val="en-US"/>
+        </w:rPr>
+        <w:t>Biopac</w:t>
+      </w:r>
+      <w:proofErr w:type="spellEnd"/>
+      <w:r>
+        <w:rPr>
+          <w:lang w:val="en-US"/>
+        </w:rPr>
+        <w:t xml:space="preserve"> PPG “Workout” smoothed data vs ECG ground truth plot, most points cluster around the bias line with random scatter, suggesting reasonable agreement but some systematic </w:t>
+      </w:r>
+      <w:r>
+        <w:rPr>
+          <w:lang w:val="en-US"/>
+        </w:rPr>
+        <w:t>difference in estimation</w:t>
+      </w:r>
+      <w:r>
+        <w:rPr>
+          <w:lang w:val="en-US"/>
+        </w:rPr>
+        <w:t xml:space="preserve"> at </w:t>
+      </w:r>
+      <w:r>
+        <w:rPr>
+          <w:lang w:val="en-US"/>
+        </w:rPr>
+        <w:t>the lower</w:t>
+      </w:r>
+      <w:r>
+        <w:rPr>
+          <w:lang w:val="en-US"/>
+        </w:rPr>
+        <w:t xml:space="preserve"> heart rates</w:t>
+      </w:r>
+      <w:r>
+        <w:rPr>
+          <w:lang w:val="en-US"/>
+        </w:rPr>
+        <w:t xml:space="preserve"> and some at higher heart rates</w:t>
+      </w:r>
+      <w:r>
+        <w:rPr>
+          <w:lang w:val="en-US"/>
+        </w:rPr>
+        <w:t xml:space="preserve">. The limits of agreement indicate the expected range of differences between methods. This helps assess both accuracy (bias) and precision (spread). In this context, it shows how reliable the </w:t>
+      </w:r>
+      <w:proofErr w:type="spellStart"/>
+      <w:r>
+        <w:rPr>
+          <w:lang w:val="en-US"/>
+        </w:rPr>
+        <w:t>Biopac</w:t>
+      </w:r>
+      <w:proofErr w:type="spellEnd"/>
+      <w:r>
+        <w:rPr>
+          <w:lang w:val="en-US"/>
+        </w:rPr>
+        <w:t xml:space="preserve"> PPG</w:t>
+      </w:r>
+      <w:r>
+        <w:rPr>
+          <w:lang w:val="en-US"/>
+        </w:rPr>
+        <w:t xml:space="preserve"> HR Detection</w:t>
+      </w:r>
+      <w:r>
+        <w:rPr>
+          <w:lang w:val="en-US"/>
+        </w:rPr>
+        <w:t xml:space="preserve"> is at tracking HR changes during workouts.</w:t>
+      </w:r>
+    </w:p>
+    <w:p>
+      <w:pPr>
+        <w:pStyle w:val="ListParagraph"/>
+        <w:numPr>
+          <w:ilvl w:val="0"/>
+          <w:numId w:val="11"/>
+        </w:numPr>
+        <w:rPr>
+          <w:lang w:val="en-US"/>
+        </w:rPr>
+      </w:pPr>
+      <w:r>
+        <w:rPr>
+          <w:lang w:val="en-US"/>
+        </w:rPr>
+        <w:t xml:space="preserve">Based on the Bland-Altman plots you can see that the </w:t>
+      </w:r>
+      <w:proofErr w:type="spellStart"/>
+      <w:r>
+        <w:rPr>
+          <w:lang w:val="en-US"/>
+        </w:rPr>
+        <w:t>BioPac</w:t>
+      </w:r>
+      <w:proofErr w:type="spellEnd"/>
+      <w:r>
+        <w:rPr>
+          <w:lang w:val="en-US"/>
+        </w:rPr>
+        <w:t xml:space="preserve"> PPG Based HR Data seems to work better than the data generated out of the smartwatch ppg curve. However, this might be due to the BP ECG Data being used as the ground truth. All in </w:t>
+      </w:r>
+      <w:proofErr w:type="gramStart"/>
+      <w:r>
+        <w:rPr>
+          <w:lang w:val="en-US"/>
+        </w:rPr>
+        <w:t>all</w:t>
+      </w:r>
+      <w:proofErr w:type="gramEnd"/>
+      <w:r>
+        <w:rPr>
+          <w:lang w:val="en-US"/>
+        </w:rPr>
+        <w:t xml:space="preserve"> though, the different BP and </w:t>
+      </w:r>
+      <w:proofErr w:type="spellStart"/>
+      <w:r>
+        <w:rPr>
+          <w:lang w:val="en-US"/>
+        </w:rPr>
+        <w:lastRenderedPageBreak/>
+        <w:t>SmartWatch</w:t>
+      </w:r>
+      <w:proofErr w:type="spellEnd"/>
+      <w:r>
+        <w:rPr>
+          <w:lang w:val="en-US"/>
+        </w:rPr>
+        <w:t xml:space="preserve"> Plots show that the mean difference is in a lot of datapoints around 0 (while the random scatter is mostly in the positive), which suggests that the differ methods have a low bias and a relatively low spread. On the other hand, the frequency-based HR extraction seems to not work very well (seen by the extremely high differences in the last two plots), the values have almost nothing in common with the selected ground truth and therefore show that this method did not work as well as hoped. </w:t>
+      </w:r>
+    </w:p>
+    <w:p>
+      <w:pPr>
+        <w:rPr>
+          <w:b/>
+          <w:bCs/>
+          <w:lang w:val="en-US"/>
+        </w:rPr>
+      </w:pPr>
+      <w:r>
+        <w:rPr>
+          <w:b/>
+          <w:bCs/>
+          <w:noProof/>
+          <w:lang w:val="en-US"/>
+        </w:rPr>
+        <w:drawing>
+          <wp:inline distT="0" distB="0" distL="0" distR="0" wp14:anchorId="01DBC59F" wp14:editId="7AADED0A">
+            <wp:extent cx="5760085" cy="2874010"/>
+            <wp:effectExtent l="0" t="0" r="5715" b="0"/>
+            <wp:docPr id="408268444" name="Picture 1" descr="A screen shot of a graph&#10;&#10;AI-generated content may be incorrect."/>
+            <wp:cNvGraphicFramePr>
+              <a:graphicFrameLocks xmlns:a="http://schemas.openxmlformats.org/drawingml/2006/main" noChangeAspect="1"/>
+            </wp:cNvGraphicFramePr>
+            <a:graphic xmlns:a="http://schemas.openxmlformats.org/drawingml/2006/main">
+              <a:graphicData uri="http://schemas.openxmlformats.org/drawingml/2006/picture">
+                <pic:pic xmlns:pic="http://schemas.openxmlformats.org/drawingml/2006/picture">
+                  <pic:nvPicPr>
+                    <pic:cNvPr id="408268444" name="Picture 1" descr="A screen shot of a graph&#10;&#10;AI-generated content may be incorrect."/>
+                    <pic:cNvPicPr/>
+                  </pic:nvPicPr>
+                  <pic:blipFill>
+                    <a:blip r:embed="rId24" cstate="print">
+                      <a:extLst>
+                        <a:ext uri="{28A0092B-C50C-407E-A947-70E740481C1C}">
+                          <a14:useLocalDpi xmlns:a14="http://schemas.microsoft.com/office/drawing/2010/main" val="0"/>
+                        </a:ext>
+                      </a:extLst>
+                    </a:blip>
+                    <a:stretch>
+                      <a:fillRect/>
+                    </a:stretch>
+                  </pic:blipFill>
+                  <pic:spPr>
+                    <a:xfrm>
+                      <a:off x="0" y="0"/>
+                      <a:ext cx="5760085" cy="2874010"/>
+                    </a:xfrm>
+                    <a:prstGeom prst="rect">
+                      <a:avLst/>
+                    </a:prstGeom>
+                  </pic:spPr>
+                </pic:pic>
+              </a:graphicData>
+            </a:graphic>
+          </wp:inline>
+        </w:drawing>
+      </w:r>
+    </w:p>
+    <w:p>
+      <w:pPr>
+        <w:rPr>
+          <w:b/>
+          <w:bCs/>
+          <w:lang w:val="en-US"/>
+        </w:rPr>
+      </w:pPr>
+    </w:p>
+    <w:p>
+      <w:pPr>
+        <w:rPr>
+          <w:b/>
+          <w:bCs/>
+          <w:lang w:val="en-US"/>
+        </w:rPr>
+      </w:pPr>
+      <w:r>
+        <w:rPr>
+          <w:b/>
+          <w:bCs/>
+          <w:noProof/>
+          <w:lang w:val="en-US"/>
+        </w:rPr>
+        <w:drawing>
+          <wp:inline distT="0" distB="0" distL="0" distR="0" wp14:anchorId="5CC9350E" wp14:editId="3A8E2854">
+            <wp:extent cx="5760085" cy="2842895"/>
+            <wp:effectExtent l="0" t="0" r="5715" b="1905"/>
+            <wp:docPr id="1217934752" name="Picture 2" descr="A screen shot of a graph&#10;&#10;AI-generated content may be incorrect."/>
+            <wp:cNvGraphicFramePr>
+              <a:graphicFrameLocks xmlns:a="http://schemas.openxmlformats.org/drawingml/2006/main" noChangeAspect="1"/>
+            </wp:cNvGraphicFramePr>
+            <a:graphic xmlns:a="http://schemas.openxmlformats.org/drawingml/2006/main">
+              <a:graphicData uri="http://schemas.openxmlformats.org/drawingml/2006/picture">
+                <pic:pic xmlns:pic="http://schemas.openxmlformats.org/drawingml/2006/picture">
+                  <pic:nvPicPr>
+                    <pic:cNvPr id="1217934752" name="Picture 2" descr="A screen shot of a graph&#10;&#10;AI-generated content may be incorrect."/>
+                    <pic:cNvPicPr/>
+                  </pic:nvPicPr>
+                  <pic:blipFill>
+                    <a:blip r:embed="rId25" cstate="print">
+                      <a:extLst>
+                        <a:ext uri="{28A0092B-C50C-407E-A947-70E740481C1C}">
+                          <a14:useLocalDpi xmlns:a14="http://schemas.microsoft.com/office/drawing/2010/main" val="0"/>
+                        </a:ext>
+                      </a:extLst>
+                    </a:blip>
+                    <a:stretch>
+                      <a:fillRect/>
+                    </a:stretch>
+                  </pic:blipFill>
+                  <pic:spPr>
+                    <a:xfrm>
+                      <a:off x="0" y="0"/>
+                      <a:ext cx="5760085" cy="2842895"/>
+                    </a:xfrm>
+                    <a:prstGeom prst="rect">
+                      <a:avLst/>
+                    </a:prstGeom>
+                  </pic:spPr>
+                </pic:pic>
+              </a:graphicData>
+            </a:graphic>
+          </wp:inline>
+        </w:drawing>
+      </w:r>
+    </w:p>
+    <w:p>
+      <w:pPr>
+        <w:rPr>
+          <w:b/>
+          <w:bCs/>
+          <w:lang w:val="en-US"/>
+        </w:rPr>
+      </w:pPr>
+    </w:p>
+    <w:p>
+      <w:pPr>
+        <w:rPr>
+          <w:b/>
+          <w:bCs/>
+          <w:lang w:val="en-US"/>
+        </w:rPr>
+      </w:pPr>
+      <w:r>
+        <w:rPr>
+          <w:noProof/>
+          <w:lang w:val="en-US"/>
+        </w:rPr>
+        <w:lastRenderedPageBreak/>
+        <w:drawing>
+          <wp:inline distT="0" distB="0" distL="0" distR="0" wp14:anchorId="1FF6AA3F" wp14:editId="057D7F6D">
+            <wp:extent cx="5760085" cy="2849245"/>
+            <wp:effectExtent l="0" t="0" r="5715" b="0"/>
+            <wp:docPr id="1717634782" name="Picture 3" descr="A screen shot of a graph&#10;&#10;AI-generated content may be incorrect."/>
+            <wp:cNvGraphicFramePr>
+              <a:graphicFrameLocks xmlns:a="http://schemas.openxmlformats.org/drawingml/2006/main" noChangeAspect="1"/>
+            </wp:cNvGraphicFramePr>
+            <a:graphic xmlns:a="http://schemas.openxmlformats.org/drawingml/2006/main">
+              <a:graphicData uri="http://schemas.openxmlformats.org/drawingml/2006/picture">
+                <pic:pic xmlns:pic="http://schemas.openxmlformats.org/drawingml/2006/picture">
+                  <pic:nvPicPr>
+                    <pic:cNvPr id="1717634782" name="Picture 3" descr="A screen shot of a graph&#10;&#10;AI-generated content may be incorrect."/>
+                    <pic:cNvPicPr/>
+                  </pic:nvPicPr>
+                  <pic:blipFill>
+                    <a:blip r:embed="rId26" cstate="print">
+                      <a:extLst>
+                        <a:ext uri="{28A0092B-C50C-407E-A947-70E740481C1C}">
+                          <a14:useLocalDpi xmlns:a14="http://schemas.microsoft.com/office/drawing/2010/main" val="0"/>
+                        </a:ext>
+                      </a:extLst>
+                    </a:blip>
+                    <a:stretch>
+                      <a:fillRect/>
+                    </a:stretch>
+                  </pic:blipFill>
+                  <pic:spPr>
+                    <a:xfrm>
+                      <a:off x="0" y="0"/>
+                      <a:ext cx="5760085" cy="2849245"/>
+                    </a:xfrm>
+                    <a:prstGeom prst="rect">
+                      <a:avLst/>
+                    </a:prstGeom>
+                  </pic:spPr>
+                </pic:pic>
+              </a:graphicData>
+            </a:graphic>
+          </wp:inline>
+        </w:drawing>
+      </w:r>
+    </w:p>
+    <w:p>
+      <w:pPr>
+        <w:rPr>
+          <w:b/>
+          <w:bCs/>
+          <w:lang w:val="en-US"/>
+        </w:rPr>
+      </w:pPr>
+    </w:p>
+    <w:p>
+      <w:pPr>
+        <w:rPr>
+          <w:b/>
+          <w:bCs/>
+          <w:lang w:val="en-US"/>
+        </w:rPr>
+      </w:pPr>
+      <w:r>
+        <w:rPr>
+          <w:b/>
+          <w:bCs/>
+          <w:noProof/>
+          <w:lang w:val="en-US"/>
+        </w:rPr>
+        <w:drawing>
+          <wp:inline distT="0" distB="0" distL="0" distR="0" wp14:anchorId="1A11E3F7" wp14:editId="0E5F9FAE">
+            <wp:extent cx="5760085" cy="2880360"/>
+            <wp:effectExtent l="0" t="0" r="5715" b="2540"/>
+            <wp:docPr id="838568086" name="Picture 4" descr="A screen shot of a graph&#10;&#10;AI-generated content may be incorrect."/>
+            <wp:cNvGraphicFramePr>
+              <a:graphicFrameLocks xmlns:a="http://schemas.openxmlformats.org/drawingml/2006/main" noChangeAspect="1"/>
+            </wp:cNvGraphicFramePr>
+            <a:graphic xmlns:a="http://schemas.openxmlformats.org/drawingml/2006/main">
+              <a:graphicData uri="http://schemas.openxmlformats.org/drawingml/2006/picture">
+                <pic:pic xmlns:pic="http://schemas.openxmlformats.org/drawingml/2006/picture">
+                  <pic:nvPicPr>
+                    <pic:cNvPr id="838568086" name="Picture 4" descr="A screen shot of a graph&#10;&#10;AI-generated content may be incorrect."/>
+                    <pic:cNvPicPr/>
+                  </pic:nvPicPr>
+                  <pic:blipFill>
+                    <a:blip r:embed="rId27" cstate="print">
+                      <a:extLst>
+                        <a:ext uri="{28A0092B-C50C-407E-A947-70E740481C1C}">
+                          <a14:useLocalDpi xmlns:a14="http://schemas.microsoft.com/office/drawing/2010/main" val="0"/>
+                        </a:ext>
+                      </a:extLst>
+                    </a:blip>
+                    <a:stretch>
+                      <a:fillRect/>
+                    </a:stretch>
+                  </pic:blipFill>
+                  <pic:spPr>
+                    <a:xfrm>
+                      <a:off x="0" y="0"/>
+                      <a:ext cx="5760085" cy="2880360"/>
+                    </a:xfrm>
+                    <a:prstGeom prst="rect">
+                      <a:avLst/>
+                    </a:prstGeom>
+                  </pic:spPr>
+                </pic:pic>
+              </a:graphicData>
+            </a:graphic>
+          </wp:inline>
+        </w:drawing>
+      </w:r>
+    </w:p>
+    <w:p>
+      <w:pPr>
+        <w:rPr>
+          <w:b/>
+          <w:bCs/>
+          <w:lang w:val="en-US"/>
+        </w:rPr>
+      </w:pPr>
+    </w:p>
+    <w:p>
+      <w:pPr>
+        <w:rPr>
+          <w:b/>
+          <w:bCs/>
+          <w:lang w:val="en-US"/>
+        </w:rPr>
+      </w:pPr>
+      <w:r>
+        <w:rPr>
+          <w:b/>
+          <w:bCs/>
+          <w:noProof/>
+          <w:lang w:val="en-US"/>
+        </w:rPr>
+        <w:lastRenderedPageBreak/>
+        <w:drawing>
+          <wp:inline distT="0" distB="0" distL="0" distR="0" wp14:anchorId="55ED4DD7" wp14:editId="3D80B9AB">
+            <wp:extent cx="5760085" cy="2852420"/>
+            <wp:effectExtent l="0" t="0" r="5715" b="5080"/>
+            <wp:docPr id="1521905524" name="Picture 5" descr="A screen shot of a graph&#10;&#10;AI-generated content may be incorrect."/>
+            <wp:cNvGraphicFramePr>
+              <a:graphicFrameLocks xmlns:a="http://schemas.openxmlformats.org/drawingml/2006/main" noChangeAspect="1"/>
+            </wp:cNvGraphicFramePr>
+            <a:graphic xmlns:a="http://schemas.openxmlformats.org/drawingml/2006/main">
+              <a:graphicData uri="http://schemas.openxmlformats.org/drawingml/2006/picture">
+                <pic:pic xmlns:pic="http://schemas.openxmlformats.org/drawingml/2006/picture">
+                  <pic:nvPicPr>
+                    <pic:cNvPr id="1521905524" name="Picture 5" descr="A screen shot of a graph&#10;&#10;AI-generated content may be incorrect."/>
+                    <pic:cNvPicPr/>
+                  </pic:nvPicPr>
+                  <pic:blipFill>
+                    <a:blip r:embed="rId28" cstate="print">
+                      <a:extLst>
+                        <a:ext uri="{28A0092B-C50C-407E-A947-70E740481C1C}">
+                          <a14:useLocalDpi xmlns:a14="http://schemas.microsoft.com/office/drawing/2010/main" val="0"/>
+                        </a:ext>
+                      </a:extLst>
+                    </a:blip>
+                    <a:stretch>
+                      <a:fillRect/>
+                    </a:stretch>
+                  </pic:blipFill>
+                  <pic:spPr>
+                    <a:xfrm>
+                      <a:off x="0" y="0"/>
+                      <a:ext cx="5760085" cy="2852420"/>
+                    </a:xfrm>
+                    <a:prstGeom prst="rect">
+                      <a:avLst/>
+                    </a:prstGeom>
+                  </pic:spPr>
+                </pic:pic>
+              </a:graphicData>
+            </a:graphic>
+          </wp:inline>
+        </w:drawing>
+      </w:r>
+    </w:p>
+    <w:p>
+      <w:pPr>
+        <w:rPr>
+          <w:b/>
+          <w:bCs/>
+          <w:lang w:val="en-US"/>
+        </w:rPr>
+      </w:pPr>
+    </w:p>
+    <w:p>
+      <w:pPr>
+        <w:rPr>
+          <w:b/>
+          <w:bCs/>
+          <w:lang w:val="en-US"/>
+        </w:rPr>
+      </w:pPr>
+      <w:r>
+        <w:rPr>
+          <w:b/>
+          <w:bCs/>
+          <w:noProof/>
+          <w:lang w:val="en-US"/>
+        </w:rPr>
+        <w:drawing>
+          <wp:inline distT="0" distB="0" distL="0" distR="0" wp14:anchorId="64F96C52" wp14:editId="69E2D134">
+            <wp:extent cx="5760085" cy="2864485"/>
+            <wp:effectExtent l="0" t="0" r="5715" b="5715"/>
+            <wp:docPr id="1904240634" name="Picture 6" descr="A screen shot of a graph&#10;&#10;AI-generated content may be incorrect."/>
+            <wp:cNvGraphicFramePr>
+              <a:graphicFrameLocks xmlns:a="http://schemas.openxmlformats.org/drawingml/2006/main" noChangeAspect="1"/>
+            </wp:cNvGraphicFramePr>
+            <a:graphic xmlns:a="http://schemas.openxmlformats.org/drawingml/2006/main">
+              <a:graphicData uri="http://schemas.openxmlformats.org/drawingml/2006/picture">
+                <pic:pic xmlns:pic="http://schemas.openxmlformats.org/drawingml/2006/picture">
+                  <pic:nvPicPr>
+                    <pic:cNvPr id="1904240634" name="Picture 6" descr="A screen shot of a graph&#10;&#10;AI-generated content may be incorrect."/>
+                    <pic:cNvPicPr/>
+                  </pic:nvPicPr>
+                  <pic:blipFill>
+                    <a:blip r:embed="rId29" cstate="print">
+                      <a:extLst>
+                        <a:ext uri="{28A0092B-C50C-407E-A947-70E740481C1C}">
+                          <a14:useLocalDpi xmlns:a14="http://schemas.microsoft.com/office/drawing/2010/main" val="0"/>
+                        </a:ext>
+                      </a:extLst>
+                    </a:blip>
+                    <a:stretch>
+                      <a:fillRect/>
+                    </a:stretch>
+                  </pic:blipFill>
+                  <pic:spPr>
+                    <a:xfrm>
+                      <a:off x="0" y="0"/>
+                      <a:ext cx="5760085" cy="2864485"/>
+                    </a:xfrm>
+                    <a:prstGeom prst="rect">
+                      <a:avLst/>
+                    </a:prstGeom>
+                  </pic:spPr>
+                </pic:pic>
+              </a:graphicData>
+            </a:graphic>
+          </wp:inline>
+        </w:drawing>
       </w:r>
     </w:p>
     <w:p>
@@ -4323,6 +4821,20 @@
     </w:p>
     <w:p>
       <w:pPr>
+        <w:rPr>
+          <w:lang w:val="en-US"/>
+        </w:rPr>
+      </w:pPr>
+    </w:p>
+    <w:p>
+      <w:pPr>
+        <w:rPr>
+          <w:lang w:val="en-US"/>
+        </w:rPr>
+      </w:pPr>
+    </w:p>
+    <w:p>
+      <w:pPr>
         <w:jc w:val="left"/>
         <w:rPr>
           <w:lang w:val="en-GB"/>
@@ -4354,8 +4866,8 @@
       </w:r>
     </w:p>
     <w:sectPr>
-      <w:headerReference w:type="default" r:id="rId24"/>
-      <w:footerReference w:type="default" r:id="rId25"/>
+      <w:headerReference w:type="default" r:id="rId30"/>
+      <w:footerReference w:type="default" r:id="rId31"/>
       <w:pgSz w:w="11906" w:h="16838"/>
       <w:pgMar w:top="1667" w:right="1134" w:bottom="1418" w:left="1701" w:header="709" w:footer="769" w:gutter="0"/>
       <w:pgNumType w:start="0"/>
@@ -5608,6 +6120,95 @@
     </w:lvl>
   </w:abstractNum>
   <w:abstractNum w:abstractNumId="9" w15:restartNumberingAfterBreak="0">
+    <w:nsid w:val="748B38CC"/>
+    <w:multiLevelType w:val="hybridMultilevel"/>
+    <w:tmpl w:val="534CF450"/>
+    <w:lvl w:ilvl="0" w:tplc="0409000F">
+      <w:start w:val="1"/>
+      <w:numFmt w:val="decimal"/>
+      <w:lvlText w:val="%1."/>
+      <w:lvlJc w:val="left"/>
+      <w:pPr>
+        <w:ind w:left="720" w:hanging="360"/>
+      </w:pPr>
+      <w:rPr>
+        <w:rFonts w:hint="default"/>
+      </w:rPr>
+    </w:lvl>
+    <w:lvl w:ilvl="1" w:tplc="04090019" w:tentative="1">
+      <w:start w:val="1"/>
+      <w:numFmt w:val="lowerLetter"/>
+      <w:lvlText w:val="%2."/>
+      <w:lvlJc w:val="left"/>
+      <w:pPr>
+        <w:ind w:left="1440" w:hanging="360"/>
+      </w:pPr>
+    </w:lvl>
+    <w:lvl w:ilvl="2" w:tplc="0409001B" w:tentative="1">
+      <w:start w:val="1"/>
+      <w:numFmt w:val="lowerRoman"/>
+      <w:lvlText w:val="%3."/>
+      <w:lvlJc w:val="right"/>
+      <w:pPr>
+        <w:ind w:left="2160" w:hanging="180"/>
+      </w:pPr>
+    </w:lvl>
+    <w:lvl w:ilvl="3" w:tplc="0409000F" w:tentative="1">
+      <w:start w:val="1"/>
+      <w:numFmt w:val="decimal"/>
+      <w:lvlText w:val="%4."/>
+      <w:lvlJc w:val="left"/>
+      <w:pPr>
+        <w:ind w:left="2880" w:hanging="360"/>
+      </w:pPr>
+    </w:lvl>
+    <w:lvl w:ilvl="4" w:tplc="04090019" w:tentative="1">
+      <w:start w:val="1"/>
+      <w:numFmt w:val="lowerLetter"/>
+      <w:lvlText w:val="%5."/>
+      <w:lvlJc w:val="left"/>
+      <w:pPr>
+        <w:ind w:left="3600" w:hanging="360"/>
+      </w:pPr>
+    </w:lvl>
+    <w:lvl w:ilvl="5" w:tplc="0409001B" w:tentative="1">
+      <w:start w:val="1"/>
+      <w:numFmt w:val="lowerRoman"/>
+      <w:lvlText w:val="%6."/>
+      <w:lvlJc w:val="right"/>
+      <w:pPr>
+        <w:ind w:left="4320" w:hanging="180"/>
+      </w:pPr>
+    </w:lvl>
+    <w:lvl w:ilvl="6" w:tplc="0409000F" w:tentative="1">
+      <w:start w:val="1"/>
+      <w:numFmt w:val="decimal"/>
+      <w:lvlText w:val="%7."/>
+      <w:lvlJc w:val="left"/>
+      <w:pPr>
+        <w:ind w:left="5040" w:hanging="360"/>
+      </w:pPr>
+    </w:lvl>
+    <w:lvl w:ilvl="7" w:tplc="04090019" w:tentative="1">
+      <w:start w:val="1"/>
+      <w:numFmt w:val="lowerLetter"/>
+      <w:lvlText w:val="%8."/>
+      <w:lvlJc w:val="left"/>
+      <w:pPr>
+        <w:ind w:left="5760" w:hanging="360"/>
+      </w:pPr>
+    </w:lvl>
+    <w:lvl w:ilvl="8" w:tplc="0409001B" w:tentative="1">
+      <w:start w:val="1"/>
+      <w:numFmt w:val="lowerRoman"/>
+      <w:lvlText w:val="%9."/>
+      <w:lvlJc w:val="right"/>
+      <w:pPr>
+        <w:ind w:left="6480" w:hanging="180"/>
+      </w:pPr>
+    </w:lvl>
+  </w:abstractNum>
+  <w:abstractNum w:abstractNumId="10" w15:restartNumberingAfterBreak="0">
     <w:nsid w:val="7A5D0410"/>
     <w:multiLevelType w:val="hybridMultilevel"/>
     <w:tmpl w:val="ACB89998"/>
@@ -5735,7 +6336,7 @@
     <w:abstractNumId w:val="2"/>
   </w:num>
   <w:num w:numId="6" w16cid:durableId="803739473">
-    <w:abstractNumId w:val="9"/>
+    <w:abstractNumId w:val="10"/>
   </w:num>
   <w:num w:numId="7" w16cid:durableId="404497130">
     <w:abstractNumId w:val="7"/>
@@ -5748,6 +6349,9 @@
   </w:num>
   <w:num w:numId="10" w16cid:durableId="1114519781">
     <w:abstractNumId w:val="5"/>
+  </w:num>
+  <w:num w:numId="11" w16cid:durableId="252398918">
+    <w:abstractNumId w:val="9"/>
   </w:num>
 </w:numbering>
 </file>
@@ -7299,13 +7903,13 @@
   <w:font w:name="Symbol">
     <w:panose1 w:val="05050102010706020507"/>
     <w:charset w:val="02"/>
-    <w:family w:val="roman"/>
+    <w:family w:val="decorative"/>
     <w:pitch w:val="variable"/>
     <w:sig w:usb0="00000000" w:usb1="10000000" w:usb2="00000000" w:usb3="00000000" w:csb0="80000000" w:csb1="00000000"/>
   </w:font>
   <w:font w:name="Times New Roman">
     <w:panose1 w:val="02020603050405020304"/>
-    <w:charset w:val="00"/>
+    <w:charset w:val="CC"/>
     <w:family w:val="roman"/>
     <w:pitch w:val="variable"/>
     <w:sig w:usb0="E0002EFF" w:usb1="C000785B" w:usb2="00000009" w:usb3="00000000" w:csb0="000001FF" w:csb1="00000000"/>
@@ -7315,17 +7919,18 @@
     <w:charset w:val="00"/>
     <w:family w:val="modern"/>
     <w:pitch w:val="fixed"/>
-    <w:sig w:usb0="E0002EFF" w:usb1="C0007843" w:usb2="00000009" w:usb3="00000000" w:csb0="000001FF" w:csb1="00000000"/>
+    <w:sig w:usb0="E0002AFF" w:usb1="C0007843" w:usb2="00000009" w:usb3="00000000" w:csb0="000001FF" w:csb1="00000000"/>
   </w:font>
   <w:font w:name="Wingdings">
     <w:panose1 w:val="05000000000000000000"/>
-    <w:charset w:val="02"/>
-    <w:family w:val="auto"/>
+    <w:charset w:val="4D"/>
+    <w:family w:val="decorative"/>
     <w:pitch w:val="variable"/>
-    <w:sig w:usb0="00000000" w:usb1="10000000" w:usb2="00000000" w:usb3="00000000" w:csb0="80000000" w:csb1="00000000"/>
+    <w:sig w:usb0="00000003" w:usb1="00000000" w:usb2="00000000" w:usb3="00000000" w:csb0="80000001" w:csb1="00000000"/>
   </w:font>
   <w:font w:name="Meta Offc Pro">
     <w:altName w:val="Calibri"/>
+    <w:panose1 w:val="020B0604020202020204"/>
     <w:charset w:val="00"/>
     <w:family w:val="swiss"/>
     <w:pitch w:val="variable"/>
@@ -7333,10 +7938,9 @@
   </w:font>
   <w:font w:name="Univers 45 Light">
     <w:altName w:val="Calibri"/>
-    <w:panose1 w:val="00000000000000000000"/>
+    <w:panose1 w:val="020B0604020202020204"/>
     <w:charset w:val="00"/>
     <w:family w:val="roman"/>
-    <w:notTrueType/>
     <w:pitch w:val="default"/>
   </w:font>
   <w:font w:name="Calibri">
@@ -7348,6 +7952,7 @@
   </w:font>
   <w:font w:name="Univers 55">
     <w:altName w:val="Calibri"/>
+    <w:panose1 w:val="020B0604020202020204"/>
     <w:charset w:val="00"/>
     <w:family w:val="auto"/>
     <w:pitch w:val="variable"/>
@@ -7355,7 +7960,7 @@
   </w:font>
   <w:font w:name="DIN-Bold">
     <w:altName w:val="Calibri"/>
-    <w:panose1 w:val="00000000000000000000"/>
+    <w:panose1 w:val="020B0604020202020204"/>
     <w:charset w:val="00"/>
     <w:family w:val="roman"/>
     <w:notTrueType/>
@@ -7370,6 +7975,7 @@
   </w:font>
   <w:font w:name="L Univers 45 Light">
     <w:altName w:val="DokChampa"/>
+    <w:panose1 w:val="020B0604020202020204"/>
     <w:charset w:val="00"/>
     <w:family w:val="auto"/>
     <w:pitch w:val="variable"/>
@@ -7380,15 +7986,17 @@
     <w:charset w:val="00"/>
     <w:family w:val="modern"/>
     <w:pitch w:val="fixed"/>
-    <w:sig w:usb0="E00006FF" w:usb1="0000FCFF" w:usb2="00000001" w:usb3="00000000" w:csb0="0000019F" w:csb1="00000000"/>
+    <w:sig w:usb0="E10006FF" w:usb1="4000FCFF" w:usb2="00000009" w:usb3="00000000" w:csb0="0000019F" w:csb1="00000000"/>
   </w:font>
   <w:font w:name="Aptos">
+    <w:panose1 w:val="020B0004020202020204"/>
     <w:charset w:val="00"/>
     <w:family w:val="swiss"/>
     <w:pitch w:val="variable"/>
     <w:sig w:usb0="20000287" w:usb1="00000003" w:usb2="00000000" w:usb3="00000000" w:csb0="0000019F" w:csb1="00000000"/>
   </w:font>
   <w:font w:name="Aptos Display">
+    <w:panose1 w:val="020B0004020202020204"/>
     <w:charset w:val="00"/>
     <w:family w:val="swiss"/>
     <w:pitch w:val="variable"/>
@@ -7428,6 +8036,7 @@
     <w:rsid w:val="006A7CFE"/>
     <w:rsid w:val="006E13AA"/>
     <w:rsid w:val="00734641"/>
+    <w:rsid w:val="0075272C"/>
     <w:rsid w:val="0075406D"/>
     <w:rsid w:val="00A32F15"/>
     <w:rsid w:val="00A36F1E"/>
@@ -7438,6 +8047,7 @@
     <w:rsid w:val="00B77025"/>
     <w:rsid w:val="00C04012"/>
     <w:rsid w:val="00C46E4C"/>
+    <w:rsid w:val="00D76533"/>
     <w:rsid w:val="00DE4AC7"/>
     <w:rsid w:val="00E36E2A"/>
     <w:rsid w:val="00E43C95"/>
@@ -7459,7 +8069,7 @@
   </m:mathPr>
   <w:themeFontLang w:val="de-DE"/>
   <w:clrSchemeMapping w:bg1="light1" w:t1="dark1" w:bg2="light2" w:t2="dark2" w:accent1="accent1" w:accent2="accent2" w:accent3="accent3" w:accent4="accent4" w:accent5="accent5" w:accent6="accent6" w:hyperlink="hyperlink" w:followedHyperlink="followedHyperlink"/>
-  <w:decimalSymbol w:val=","/>
+  <w:decimalSymbol w:val="."/>
   <w:listSeparator w:val=","/>
   <w15:chartTrackingRefBased/>
 </w:settings>
@@ -8216,4 +8826,10 @@
     <ds:schemaRef ds:uri="http://schemas.openxmlformats.org/officeDocument/2006/bibliography"/>
   </ds:schemaRefs>
 </ds:datastoreItem>
+</file>
+
+<file path=docMetadata/LabelInfo.xml><?xml version="1.0" encoding="utf-8"?>
+<clbl:labelList xmlns:clbl="http://schemas.microsoft.com/office/2020/mipLabelMetadata">
+  <clbl:label id="{2d1c7476-f302-47ca-97a0-972f32671471}" enabled="1" method="Standard" siteId="{72e15514-5be9-46a8-8b0b-af9b1b77b3b8}" contentBits="0" removed="0"/>
+</clbl:labelList>
 </file>
</xml_diff>

<commit_message>
added 5 TODOs to the docx, final stretch guys, almost done
</commit_message>
<xml_diff>
--- a/assignment_3.docx
+++ b/assignment_3.docx
@@ -407,24 +407,60 @@
           <w:bCs/>
           <w:lang w:val="en-US"/>
         </w:rPr>
-        <w:t>Cut the signals in order that it only contains the exercise. Plot the PPG (biopac), PPG</w:t>
-      </w:r>
-    </w:p>
-    <w:p>
-      <w:pPr>
-        <w:rPr>
-          <w:b/>
-          <w:bCs/>
-          <w:lang w:val="en-US"/>
-        </w:rPr>
-      </w:pPr>
-      <w:r>
-        <w:rPr>
-          <w:b/>
-          <w:bCs/>
-          <w:lang w:val="en-US"/>
-        </w:rPr>
-        <w:t>(smartwatch), ECG (biopac), Acceleration data (smartwatch) each in an own plot (4 plots) with</w:t>
+        <w:t>Cut the signals in order that it only contains the exercise. Plot the PPG (</w:t>
+      </w:r>
+      <w:proofErr w:type="spellStart"/>
+      <w:r>
+        <w:rPr>
+          <w:b/>
+          <w:bCs/>
+          <w:lang w:val="en-US"/>
+        </w:rPr>
+        <w:t>biopac</w:t>
+      </w:r>
+      <w:proofErr w:type="spellEnd"/>
+      <w:r>
+        <w:rPr>
+          <w:b/>
+          <w:bCs/>
+          <w:lang w:val="en-US"/>
+        </w:rPr>
+        <w:t>), PPG</w:t>
+      </w:r>
+    </w:p>
+    <w:p>
+      <w:pPr>
+        <w:rPr>
+          <w:b/>
+          <w:bCs/>
+          <w:lang w:val="en-US"/>
+        </w:rPr>
+      </w:pPr>
+      <w:r>
+        <w:rPr>
+          <w:b/>
+          <w:bCs/>
+          <w:lang w:val="en-US"/>
+        </w:rPr>
+        <w:t>(smartwatch), ECG (</w:t>
+      </w:r>
+      <w:proofErr w:type="spellStart"/>
+      <w:r>
+        <w:rPr>
+          <w:b/>
+          <w:bCs/>
+          <w:lang w:val="en-US"/>
+        </w:rPr>
+        <w:t>biopac</w:t>
+      </w:r>
+      <w:proofErr w:type="spellEnd"/>
+      <w:r>
+        <w:rPr>
+          <w:b/>
+          <w:bCs/>
+          <w:lang w:val="en-US"/>
+        </w:rPr>
+        <w:t>), Acceleration data (smartwatch) each in an own plot (4 plots) with</w:t>
       </w:r>
     </w:p>
     <w:p>
@@ -469,7 +505,16 @@
           <w:color w:val="C00000"/>
           <w:lang w:val="en-US"/>
         </w:rPr>
-        <w:t>TODO: mark transitions</w:t>
+        <w:t xml:space="preserve">TODO: </w:t>
+      </w:r>
+      <w:r>
+        <w:rPr>
+          <w:b/>
+          <w:bCs/>
+          <w:color w:val="C00000"/>
+          <w:lang w:val="en-US"/>
+        </w:rPr>
+        <w:t>check if markers are correct</w:t>
       </w:r>
     </w:p>
     <w:p>
@@ -572,7 +617,23 @@
           <w:color w:val="7F7F7F" w:themeColor="text1" w:themeTint="80"/>
           <w:lang w:val="en-US"/>
         </w:rPr>
-        <w:t xml:space="preserve"> (top) and ECG containing the same exercise from BioPac (bottom)</w:t>
+        <w:t xml:space="preserve"> (top) and ECG containing the same exercise from </w:t>
+      </w:r>
+      <w:proofErr w:type="spellStart"/>
+      <w:r>
+        <w:rPr>
+          <w:color w:val="7F7F7F" w:themeColor="text1" w:themeTint="80"/>
+          <w:lang w:val="en-US"/>
+        </w:rPr>
+        <w:t>BioPac</w:t>
+      </w:r>
+      <w:proofErr w:type="spellEnd"/>
+      <w:r>
+        <w:rPr>
+          <w:color w:val="7F7F7F" w:themeColor="text1" w:themeTint="80"/>
+          <w:lang w:val="en-US"/>
+        </w:rPr>
+        <w:t xml:space="preserve"> (bottom)</w:t>
       </w:r>
     </w:p>
     <w:p>
@@ -644,8 +705,17 @@
           <w:color w:val="7F7F7F" w:themeColor="text1" w:themeTint="80"/>
           <w:lang w:val="en-US"/>
         </w:rPr>
-        <w:t>Figure 2: PPG containing only the exercise from BioPac</w:t>
-      </w:r>
+        <w:t xml:space="preserve">Figure 2: PPG containing only the exercise from </w:t>
+      </w:r>
+      <w:proofErr w:type="spellStart"/>
+      <w:r>
+        <w:rPr>
+          <w:color w:val="7F7F7F" w:themeColor="text1" w:themeTint="80"/>
+          <w:lang w:val="en-US"/>
+        </w:rPr>
+        <w:t>BioPac</w:t>
+      </w:r>
+      <w:proofErr w:type="spellEnd"/>
     </w:p>
     <w:p>
       <w:pPr>
@@ -801,24 +871,60 @@
           <w:bCs/>
           <w:lang w:val="en-US"/>
         </w:rPr>
-        <w:t>measurement. Cut the signals in order that it only contains the exercise. Plot the PPG (biopac),</w:t>
-      </w:r>
-    </w:p>
-    <w:p>
-      <w:pPr>
-        <w:rPr>
-          <w:b/>
-          <w:bCs/>
-          <w:lang w:val="en-US"/>
-        </w:rPr>
-      </w:pPr>
-      <w:r>
-        <w:rPr>
-          <w:b/>
-          <w:bCs/>
-          <w:lang w:val="en-US"/>
-        </w:rPr>
-        <w:t>PPG (smartwatch), ECG (biopac), Acceleration data (smartwatch) each in an own plot (4 plots)</w:t>
+        <w:t>measurement. Cut the signals in order that it only contains the exercise. Plot the PPG (</w:t>
+      </w:r>
+      <w:proofErr w:type="spellStart"/>
+      <w:r>
+        <w:rPr>
+          <w:b/>
+          <w:bCs/>
+          <w:lang w:val="en-US"/>
+        </w:rPr>
+        <w:t>biopac</w:t>
+      </w:r>
+      <w:proofErr w:type="spellEnd"/>
+      <w:r>
+        <w:rPr>
+          <w:b/>
+          <w:bCs/>
+          <w:lang w:val="en-US"/>
+        </w:rPr>
+        <w:t>),</w:t>
+      </w:r>
+    </w:p>
+    <w:p>
+      <w:pPr>
+        <w:rPr>
+          <w:b/>
+          <w:bCs/>
+          <w:lang w:val="en-US"/>
+        </w:rPr>
+      </w:pPr>
+      <w:r>
+        <w:rPr>
+          <w:b/>
+          <w:bCs/>
+          <w:lang w:val="en-US"/>
+        </w:rPr>
+        <w:t>PPG (smartwatch), ECG (</w:t>
+      </w:r>
+      <w:proofErr w:type="spellStart"/>
+      <w:r>
+        <w:rPr>
+          <w:b/>
+          <w:bCs/>
+          <w:lang w:val="en-US"/>
+        </w:rPr>
+        <w:t>biopac</w:t>
+      </w:r>
+      <w:proofErr w:type="spellEnd"/>
+      <w:r>
+        <w:rPr>
+          <w:b/>
+          <w:bCs/>
+          <w:lang w:val="en-US"/>
+        </w:rPr>
+        <w:t>), Acceleration data (smartwatch) each in an own plot (4 plots)</w:t>
       </w:r>
     </w:p>
     <w:p>
@@ -931,7 +1037,23 @@
           <w:color w:val="7F7F7F" w:themeColor="text1" w:themeTint="80"/>
           <w:lang w:val="en-US"/>
         </w:rPr>
-        <w:t>PPG containing only the exercise from Smartwatch (top) and ECG containing the same exercise from BioPac (bottom)</w:t>
+        <w:t xml:space="preserve">PPG containing only the exercise from Smartwatch (top) and ECG containing the same exercise from </w:t>
+      </w:r>
+      <w:proofErr w:type="spellStart"/>
+      <w:r>
+        <w:rPr>
+          <w:color w:val="7F7F7F" w:themeColor="text1" w:themeTint="80"/>
+          <w:lang w:val="en-US"/>
+        </w:rPr>
+        <w:t>BioPac</w:t>
+      </w:r>
+      <w:proofErr w:type="spellEnd"/>
+      <w:r>
+        <w:rPr>
+          <w:color w:val="7F7F7F" w:themeColor="text1" w:themeTint="80"/>
+          <w:lang w:val="en-US"/>
+        </w:rPr>
+        <w:t xml:space="preserve"> (bottom)</w:t>
       </w:r>
       <w:r>
         <w:rPr>
@@ -1011,8 +1133,33 @@
           <w:color w:val="7F7F7F" w:themeColor="text1" w:themeTint="80"/>
           <w:lang w:val="en-US"/>
         </w:rPr>
-        <w:t>Figure 5: PPG containing only the exercise from BioPac</w:t>
-      </w:r>
+        <w:t xml:space="preserve">Figure 5: PPG containing only </w:t>
+      </w:r>
+      <w:proofErr w:type="gramStart"/>
+      <w:r>
+        <w:rPr>
+          <w:color w:val="7F7F7F" w:themeColor="text1" w:themeTint="80"/>
+          <w:lang w:val="en-US"/>
+        </w:rPr>
+        <w:t>the exercise</w:t>
+      </w:r>
+      <w:proofErr w:type="gramEnd"/>
+      <w:r>
+        <w:rPr>
+          <w:color w:val="7F7F7F" w:themeColor="text1" w:themeTint="80"/>
+          <w:lang w:val="en-US"/>
+        </w:rPr>
+        <w:t xml:space="preserve"> from </w:t>
+      </w:r>
+      <w:proofErr w:type="spellStart"/>
+      <w:r>
+        <w:rPr>
+          <w:color w:val="7F7F7F" w:themeColor="text1" w:themeTint="80"/>
+          <w:lang w:val="en-US"/>
+        </w:rPr>
+        <w:t>BioPac</w:t>
+      </w:r>
+      <w:proofErr w:type="spellEnd"/>
       <w:r>
         <w:rPr>
           <w:color w:val="7F7F7F" w:themeColor="text1" w:themeTint="80"/>
@@ -1467,7 +1614,23 @@
           <w:color w:val="7F7F7F" w:themeColor="text1" w:themeTint="80"/>
           <w:lang w:val="en-US"/>
         </w:rPr>
-        <w:t xml:space="preserve"> on BioPac ECG</w:t>
+        <w:t xml:space="preserve"> on </w:t>
+      </w:r>
+      <w:proofErr w:type="spellStart"/>
+      <w:r>
+        <w:rPr>
+          <w:color w:val="7F7F7F" w:themeColor="text1" w:themeTint="80"/>
+          <w:lang w:val="en-US"/>
+        </w:rPr>
+        <w:t>BioPac</w:t>
+      </w:r>
+      <w:proofErr w:type="spellEnd"/>
+      <w:r>
+        <w:rPr>
+          <w:color w:val="7F7F7F" w:themeColor="text1" w:themeTint="80"/>
+          <w:lang w:val="en-US"/>
+        </w:rPr>
+        <w:t xml:space="preserve"> ECG</w:t>
       </w:r>
     </w:p>
     <w:p>
@@ -1547,7 +1710,23 @@
           <w:color w:val="7F7F7F" w:themeColor="text1" w:themeTint="80"/>
           <w:lang w:val="en-US"/>
         </w:rPr>
-        <w:t>poorly on BioPac ECG</w:t>
+        <w:t xml:space="preserve">poorly on </w:t>
+      </w:r>
+      <w:proofErr w:type="spellStart"/>
+      <w:r>
+        <w:rPr>
+          <w:color w:val="7F7F7F" w:themeColor="text1" w:themeTint="80"/>
+          <w:lang w:val="en-US"/>
+        </w:rPr>
+        <w:t>BioPac</w:t>
+      </w:r>
+      <w:proofErr w:type="spellEnd"/>
+      <w:r>
+        <w:rPr>
+          <w:color w:val="7F7F7F" w:themeColor="text1" w:themeTint="80"/>
+          <w:lang w:val="en-US"/>
+        </w:rPr>
+        <w:t xml:space="preserve"> ECG</w:t>
       </w:r>
     </w:p>
     <w:p>
@@ -1985,7 +2164,23 @@
           <w:color w:val="7F7F7F" w:themeColor="text1" w:themeTint="80"/>
           <w:lang w:val="en-US"/>
         </w:rPr>
-        <w:t>Figure 10: R-Peak Detection that worked well on BioPac ECG</w:t>
+        <w:t xml:space="preserve">Figure 10: R-Peak Detection that worked well on </w:t>
+      </w:r>
+      <w:proofErr w:type="spellStart"/>
+      <w:r>
+        <w:rPr>
+          <w:color w:val="7F7F7F" w:themeColor="text1" w:themeTint="80"/>
+          <w:lang w:val="en-US"/>
+        </w:rPr>
+        <w:t>BioPac</w:t>
+      </w:r>
+      <w:proofErr w:type="spellEnd"/>
+      <w:r>
+        <w:rPr>
+          <w:color w:val="7F7F7F" w:themeColor="text1" w:themeTint="80"/>
+          <w:lang w:val="en-US"/>
+        </w:rPr>
+        <w:t xml:space="preserve"> ECG</w:t>
       </w:r>
     </w:p>
     <w:p>
@@ -2061,7 +2256,23 @@
           <w:color w:val="7F7F7F" w:themeColor="text1" w:themeTint="80"/>
           <w:lang w:val="en-US"/>
         </w:rPr>
-        <w:t>Figure 11: R-Peak Detection that worked poorly on BioPac ECG</w:t>
+        <w:t xml:space="preserve">Figure 11: R-Peak Detection that worked poorly on </w:t>
+      </w:r>
+      <w:proofErr w:type="spellStart"/>
+      <w:r>
+        <w:rPr>
+          <w:color w:val="7F7F7F" w:themeColor="text1" w:themeTint="80"/>
+          <w:lang w:val="en-US"/>
+        </w:rPr>
+        <w:t>BioPac</w:t>
+      </w:r>
+      <w:proofErr w:type="spellEnd"/>
+      <w:r>
+        <w:rPr>
+          <w:color w:val="7F7F7F" w:themeColor="text1" w:themeTint="80"/>
+          <w:lang w:val="en-US"/>
+        </w:rPr>
+        <w:t xml:space="preserve"> ECG</w:t>
       </w:r>
     </w:p>
     <w:p>
@@ -2447,6 +2658,34 @@
         <w:rPr>
           <w:b/>
           <w:bCs/>
+          <w:color w:val="C00000"/>
+          <w:lang w:val="en-US"/>
+        </w:rPr>
+      </w:pPr>
+      <w:r>
+        <w:rPr>
+          <w:b/>
+          <w:bCs/>
+          <w:color w:val="C00000"/>
+          <w:lang w:val="en-US"/>
+        </w:rPr>
+        <w:t>TODO: check if good and faulty graphs are mixed up</w:t>
+      </w:r>
+    </w:p>
+    <w:p>
+      <w:pPr>
+        <w:rPr>
+          <w:b/>
+          <w:bCs/>
+          <w:lang w:val="en-US"/>
+        </w:rPr>
+      </w:pPr>
+    </w:p>
+    <w:p>
+      <w:pPr>
+        <w:rPr>
+          <w:b/>
+          <w:bCs/>
           <w:lang w:val="en-US"/>
         </w:rPr>
       </w:pPr>
@@ -2680,7 +2919,35 @@
         <w:rPr>
           <w:lang w:val="en-US"/>
         </w:rPr>
-        <w:t>The differences are the same as for the previous two questions. However it is notable that the subjects heart rate does not appear to rise as much as it did during this exercise when the heart rate was derived from the BioPac ECG data, and the smoothed heart rate is also much more prone to change. (Compare Figure 9)</w:t>
+        <w:t xml:space="preserve">The differences are the same as for the previous two questions. </w:t>
+      </w:r>
+      <w:proofErr w:type="gramStart"/>
+      <w:r>
+        <w:rPr>
+          <w:lang w:val="en-US"/>
+        </w:rPr>
+        <w:t>However</w:t>
+      </w:r>
+      <w:proofErr w:type="gramEnd"/>
+      <w:r>
+        <w:rPr>
+          <w:lang w:val="en-US"/>
+        </w:rPr>
+        <w:t xml:space="preserve"> it is notable that the subjects heart rate does not appear to rise as much as it did during this exercise when the heart rate was derived from the </w:t>
+      </w:r>
+      <w:proofErr w:type="spellStart"/>
+      <w:r>
+        <w:rPr>
+          <w:lang w:val="en-US"/>
+        </w:rPr>
+        <w:t>BioPac</w:t>
+      </w:r>
+      <w:proofErr w:type="spellEnd"/>
+      <w:r>
+        <w:rPr>
+          <w:lang w:val="en-US"/>
+        </w:rPr>
+        <w:t xml:space="preserve"> ECG data, and the smoothed heart rate is also much more prone to change. (Compare Figure 9)</w:t>
       </w:r>
     </w:p>
     <w:p>
@@ -2720,24 +2987,60 @@
           <w:bCs/>
           <w:lang w:val="en-US"/>
         </w:rPr>
-        <w:t>Consider the data “Stairs” and use the biopac PPG data. Document which one</w:t>
-      </w:r>
-    </w:p>
-    <w:p>
-      <w:pPr>
-        <w:rPr>
-          <w:b/>
-          <w:bCs/>
-          <w:lang w:val="en-US"/>
-        </w:rPr>
-      </w:pPr>
-      <w:r>
-        <w:rPr>
-          <w:b/>
-          <w:bCs/>
-          <w:lang w:val="en-US"/>
-        </w:rPr>
-        <w:t>you are using in order to allocate the data to the correct tracks above. Use the neurokit2 toolbox</w:t>
+        <w:t xml:space="preserve">Consider the data “Stairs” and use the </w:t>
+      </w:r>
+      <w:proofErr w:type="spellStart"/>
+      <w:r>
+        <w:rPr>
+          <w:b/>
+          <w:bCs/>
+          <w:lang w:val="en-US"/>
+        </w:rPr>
+        <w:t>biopac</w:t>
+      </w:r>
+      <w:proofErr w:type="spellEnd"/>
+      <w:r>
+        <w:rPr>
+          <w:b/>
+          <w:bCs/>
+          <w:lang w:val="en-US"/>
+        </w:rPr>
+        <w:t xml:space="preserve"> PPG data. Document which one</w:t>
+      </w:r>
+    </w:p>
+    <w:p>
+      <w:pPr>
+        <w:rPr>
+          <w:b/>
+          <w:bCs/>
+          <w:lang w:val="en-US"/>
+        </w:rPr>
+      </w:pPr>
+      <w:r>
+        <w:rPr>
+          <w:b/>
+          <w:bCs/>
+          <w:lang w:val="en-US"/>
+        </w:rPr>
+        <w:t xml:space="preserve">you are using </w:t>
+      </w:r>
+      <w:proofErr w:type="gramStart"/>
+      <w:r>
+        <w:rPr>
+          <w:b/>
+          <w:bCs/>
+          <w:lang w:val="en-US"/>
+        </w:rPr>
+        <w:t>in order to</w:t>
+      </w:r>
+      <w:proofErr w:type="gramEnd"/>
+      <w:r>
+        <w:rPr>
+          <w:b/>
+          <w:bCs/>
+          <w:lang w:val="en-US"/>
+        </w:rPr>
+        <w:t xml:space="preserve"> allocate the data to the correct tracks above. Use the neurokit2 toolbox</w:t>
       </w:r>
     </w:p>
     <w:p>
@@ -3048,6 +3351,7 @@
         </w:rPr>
         <w:t xml:space="preserve"> on </w:t>
       </w:r>
+      <w:proofErr w:type="spellStart"/>
       <w:r>
         <w:rPr>
           <w:color w:val="7F7F7F" w:themeColor="text1" w:themeTint="80"/>
@@ -3055,6 +3359,7 @@
         </w:rPr>
         <w:t>BioPac</w:t>
       </w:r>
+      <w:proofErr w:type="spellEnd"/>
       <w:r>
         <w:rPr>
           <w:color w:val="7F7F7F" w:themeColor="text1" w:themeTint="80"/>
@@ -3162,7 +3467,23 @@
           <w:color w:val="7F7F7F" w:themeColor="text1" w:themeTint="80"/>
           <w:lang w:val="en-US"/>
         </w:rPr>
-        <w:t xml:space="preserve"> on BioPac PPG</w:t>
+        <w:t xml:space="preserve"> on </w:t>
+      </w:r>
+      <w:proofErr w:type="spellStart"/>
+      <w:r>
+        <w:rPr>
+          <w:color w:val="7F7F7F" w:themeColor="text1" w:themeTint="80"/>
+          <w:lang w:val="en-US"/>
+        </w:rPr>
+        <w:t>BioPac</w:t>
+      </w:r>
+      <w:proofErr w:type="spellEnd"/>
+      <w:r>
+        <w:rPr>
+          <w:color w:val="7F7F7F" w:themeColor="text1" w:themeTint="80"/>
+          <w:lang w:val="en-US"/>
+        </w:rPr>
+        <w:t xml:space="preserve"> PPG</w:t>
       </w:r>
       <w:r>
         <w:rPr>
@@ -3257,7 +3578,39 @@
           <w:color w:val="7F7F7F" w:themeColor="text1" w:themeTint="80"/>
           <w:lang w:val="en-US"/>
         </w:rPr>
-        <w:t>: Heart rate during the exercise: instant heart rate (blue) and smoothed heart rate (orange)</w:t>
+        <w:t xml:space="preserve">: Heart rate during </w:t>
+      </w:r>
+      <w:proofErr w:type="gramStart"/>
+      <w:r>
+        <w:rPr>
+          <w:color w:val="7F7F7F" w:themeColor="text1" w:themeTint="80"/>
+          <w:lang w:val="en-US"/>
+        </w:rPr>
+        <w:t>the exercise</w:t>
+      </w:r>
+      <w:proofErr w:type="gramEnd"/>
+      <w:r>
+        <w:rPr>
+          <w:color w:val="7F7F7F" w:themeColor="text1" w:themeTint="80"/>
+          <w:lang w:val="en-US"/>
+        </w:rPr>
+        <w:t xml:space="preserve">: instant heart rate (blue) and </w:t>
+      </w:r>
+      <w:proofErr w:type="gramStart"/>
+      <w:r>
+        <w:rPr>
+          <w:color w:val="7F7F7F" w:themeColor="text1" w:themeTint="80"/>
+          <w:lang w:val="en-US"/>
+        </w:rPr>
+        <w:t>smoothed</w:t>
+      </w:r>
+      <w:proofErr w:type="gramEnd"/>
+      <w:r>
+        <w:rPr>
+          <w:color w:val="7F7F7F" w:themeColor="text1" w:themeTint="80"/>
+          <w:lang w:val="en-US"/>
+        </w:rPr>
+        <w:t xml:space="preserve"> heart rate (orange)</w:t>
       </w:r>
     </w:p>
     <w:p>
@@ -3447,22 +3800,95 @@
           <w:color w:val="auto"/>
           <w:lang w:val="en-US"/>
         </w:rPr>
-        <w:t xml:space="preserve">The PPG taken as measured by the BioPac, on a small scale, mirrors the idealized PPG curve much more closely than the PPG measured by the smartwatch, where </w:t>
-      </w:r>
+        <w:t xml:space="preserve">The PPG taken as measured by the </w:t>
+      </w:r>
+      <w:proofErr w:type="spellStart"/>
       <w:r>
         <w:rPr>
           <w:color w:val="auto"/>
           <w:lang w:val="en-US"/>
         </w:rPr>
-        <w:t xml:space="preserve">only the systole and (for most instances) the diastole are clearly defined. It’s also much less prone to noise. The instant heartrate derived by the </w:t>
-      </w:r>
+        <w:t>BioPac</w:t>
+      </w:r>
+      <w:proofErr w:type="spellEnd"/>
       <w:r>
         <w:rPr>
           <w:color w:val="auto"/>
           <w:lang w:val="en-US"/>
         </w:rPr>
+        <w:t xml:space="preserve">, on a small scale, mirrors the idealized PPG curve much more closely than the PPG measured by the smartwatch, where </w:t>
+      </w:r>
+      <w:r>
+        <w:rPr>
+          <w:color w:val="auto"/>
+          <w:lang w:val="en-US"/>
+        </w:rPr>
+        <w:t xml:space="preserve">only the systole and (for most instances) the diastole </w:t>
+      </w:r>
+      <w:proofErr w:type="gramStart"/>
+      <w:r>
+        <w:rPr>
+          <w:color w:val="auto"/>
+          <w:lang w:val="en-US"/>
+        </w:rPr>
+        <w:t>are</w:t>
+      </w:r>
+      <w:proofErr w:type="gramEnd"/>
+      <w:r>
+        <w:rPr>
+          <w:color w:val="auto"/>
+          <w:lang w:val="en-US"/>
+        </w:rPr>
+        <w:t xml:space="preserve"> clearly defined. It’s also much less prone to noise. The instant heartrate derived by the </w:t>
+      </w:r>
+      <w:proofErr w:type="spellStart"/>
+      <w:r>
+        <w:rPr>
+          <w:color w:val="auto"/>
+          <w:lang w:val="en-US"/>
+        </w:rPr>
         <w:lastRenderedPageBreak/>
-        <w:t>BioPac less likely to show sudden jumps to extreme values, which also reflects on the smoothed heart rate, which is much less volatile. It’s also possible to clearly make out the start of the exercise, the end of the exercise, and the recovery period in the BioPac data (see graph below).</w:t>
+        <w:t>BioPac</w:t>
+      </w:r>
+      <w:proofErr w:type="spellEnd"/>
+      <w:r>
+        <w:rPr>
+          <w:color w:val="auto"/>
+          <w:lang w:val="en-US"/>
+        </w:rPr>
+        <w:t xml:space="preserve"> </w:t>
+      </w:r>
+      <w:proofErr w:type="gramStart"/>
+      <w:r>
+        <w:rPr>
+          <w:color w:val="auto"/>
+          <w:lang w:val="en-US"/>
+        </w:rPr>
+        <w:t>less</w:t>
+      </w:r>
+      <w:proofErr w:type="gramEnd"/>
+      <w:r>
+        <w:rPr>
+          <w:color w:val="auto"/>
+          <w:lang w:val="en-US"/>
+        </w:rPr>
+        <w:t xml:space="preserve"> likely to show sudden jumps to extreme values, which also reflects on the smoothed heart rate, which is much less volatile. It’s also possible to clearly make out the start of the exercise, the end of the exercise, and the recovery period in the </w:t>
+      </w:r>
+      <w:proofErr w:type="spellStart"/>
+      <w:r>
+        <w:rPr>
+          <w:color w:val="auto"/>
+          <w:lang w:val="en-US"/>
+        </w:rPr>
+        <w:t>BioPac</w:t>
+      </w:r>
+      <w:proofErr w:type="spellEnd"/>
+      <w:r>
+        <w:rPr>
+          <w:color w:val="auto"/>
+          <w:lang w:val="en-US"/>
+        </w:rPr>
+        <w:t xml:space="preserve"> data (see graph below).</w:t>
       </w:r>
     </w:p>
     <w:p>
@@ -3591,7 +4017,21 @@
         <w:rPr>
           <w:lang w:val="en-US"/>
         </w:rPr>
-        <w:t xml:space="preserve">Finding the same points in the heartrate graph derived from the smartwatch PPG is much harder and less definite, as the data is much noisier. There’s also nowhere near as clear a </w:t>
+        <w:t xml:space="preserve">Finding the same points in the heartrate graph derived from the smartwatch PPG is much harder and less definite, as the data is much noisier. There’s also nowhere near as </w:t>
+      </w:r>
+      <w:proofErr w:type="gramStart"/>
+      <w:r>
+        <w:rPr>
+          <w:lang w:val="en-US"/>
+        </w:rPr>
+        <w:t>clear</w:t>
+      </w:r>
+      <w:proofErr w:type="gramEnd"/>
+      <w:r>
+        <w:rPr>
+          <w:lang w:val="en-US"/>
+        </w:rPr>
+        <w:t xml:space="preserve"> a </w:t>
       </w:r>
       <w:r>
         <w:rPr>
@@ -3613,11 +4053,47 @@
           <w:lang w:val="en-US"/>
         </w:rPr>
       </w:pPr>
-      <w:r>
-        <w:rPr>
-          <w:lang w:val="en-US"/>
-        </w:rPr>
-        <w:t xml:space="preserve">Additionally we note that, even though the later questions consider the BioPac ECG data the ground truth for the heartrate, the R-Peak detection was much less faulty on the BioPac PPG data (compare Figure 10 and 11 to Figure 16 and 17), and therefore the heartrate derived from the PPG data is more accurate in this case. </w:t>
+      <w:proofErr w:type="gramStart"/>
+      <w:r>
+        <w:rPr>
+          <w:lang w:val="en-US"/>
+        </w:rPr>
+        <w:t>Additionally</w:t>
+      </w:r>
+      <w:proofErr w:type="gramEnd"/>
+      <w:r>
+        <w:rPr>
+          <w:lang w:val="en-US"/>
+        </w:rPr>
+        <w:t xml:space="preserve"> we note that, even though the later questions consider the </w:t>
+      </w:r>
+      <w:proofErr w:type="spellStart"/>
+      <w:r>
+        <w:rPr>
+          <w:lang w:val="en-US"/>
+        </w:rPr>
+        <w:t>BioPac</w:t>
+      </w:r>
+      <w:proofErr w:type="spellEnd"/>
+      <w:r>
+        <w:rPr>
+          <w:lang w:val="en-US"/>
+        </w:rPr>
+        <w:t xml:space="preserve"> ECG data the ground truth for the heartrate, the R-Peak detection was much less faulty on the </w:t>
+      </w:r>
+      <w:proofErr w:type="spellStart"/>
+      <w:r>
+        <w:rPr>
+          <w:lang w:val="en-US"/>
+        </w:rPr>
+        <w:t>BioPac</w:t>
+      </w:r>
+      <w:proofErr w:type="spellEnd"/>
+      <w:r>
+        <w:rPr>
+          <w:lang w:val="en-US"/>
+        </w:rPr>
+        <w:t xml:space="preserve"> PPG data (compare Figure 10 and 11 to Figure 16 and 17), and therefore the heartrate derived from the PPG data is more accurate in this case. </w:t>
       </w:r>
     </w:p>
     <w:p>
@@ -3676,7 +4152,25 @@
           <w:bCs/>
           <w:lang w:val="en-US"/>
         </w:rPr>
-        <w:t>this Question. Document which one you are using in order to allocate the data to the correct</w:t>
+        <w:t xml:space="preserve">this Question. Document which one you are using </w:t>
+      </w:r>
+      <w:proofErr w:type="gramStart"/>
+      <w:r>
+        <w:rPr>
+          <w:b/>
+          <w:bCs/>
+          <w:lang w:val="en-US"/>
+        </w:rPr>
+        <w:t>in order to</w:t>
+      </w:r>
+      <w:proofErr w:type="gramEnd"/>
+      <w:r>
+        <w:rPr>
+          <w:b/>
+          <w:bCs/>
+          <w:lang w:val="en-US"/>
+        </w:rPr>
+        <w:t xml:space="preserve"> allocate the data to the correct</w:t>
       </w:r>
     </w:p>
     <w:p>
@@ -3710,58 +4204,148 @@
           <w:bCs/>
           <w:lang w:val="en-US"/>
         </w:rPr>
-        <w:t>identify the heart rate in the frequency domain, i.e. do a fast fourier transform for heart rate</w:t>
-      </w:r>
-    </w:p>
-    <w:p>
-      <w:pPr>
-        <w:rPr>
-          <w:b/>
-          <w:bCs/>
-          <w:lang w:val="en-US"/>
-        </w:rPr>
-      </w:pPr>
-      <w:r>
-        <w:rPr>
-          <w:b/>
-          <w:bCs/>
-          <w:lang w:val="en-US"/>
-        </w:rPr>
-        <w:t>extraction. Before transforming the window into the frequency domain you should do some</w:t>
-      </w:r>
-    </w:p>
-    <w:p>
-      <w:pPr>
-        <w:rPr>
-          <w:b/>
-          <w:bCs/>
-          <w:lang w:val="en-US"/>
-        </w:rPr>
-      </w:pPr>
-      <w:r>
-        <w:rPr>
-          <w:b/>
-          <w:bCs/>
-          <w:lang w:val="en-US"/>
-        </w:rPr>
-        <w:t>preprocessing for the 10 s window (e.g. highpass filtering at a meaningful frequency (e.g. using</w:t>
-      </w:r>
-    </w:p>
-    <w:p>
-      <w:pPr>
-        <w:rPr>
-          <w:b/>
-          <w:bCs/>
-          <w:lang w:val="en-US"/>
-        </w:rPr>
-      </w:pPr>
-      <w:r>
-        <w:rPr>
-          <w:b/>
-          <w:bCs/>
-          <w:lang w:val="en-US"/>
-        </w:rPr>
-        <w:t>for example butterworth) or detrending). Then find a way to algorithmically detect the heart rate</w:t>
+        <w:t xml:space="preserve">identify the heart rate in the frequency domain, i.e. do a fast </w:t>
+      </w:r>
+      <w:proofErr w:type="spellStart"/>
+      <w:r>
+        <w:rPr>
+          <w:b/>
+          <w:bCs/>
+          <w:lang w:val="en-US"/>
+        </w:rPr>
+        <w:t>fourier</w:t>
+      </w:r>
+      <w:proofErr w:type="spellEnd"/>
+      <w:r>
+        <w:rPr>
+          <w:b/>
+          <w:bCs/>
+          <w:lang w:val="en-US"/>
+        </w:rPr>
+        <w:t xml:space="preserve"> transform for heart rate</w:t>
+      </w:r>
+    </w:p>
+    <w:p>
+      <w:pPr>
+        <w:rPr>
+          <w:b/>
+          <w:bCs/>
+          <w:lang w:val="en-US"/>
+        </w:rPr>
+      </w:pPr>
+      <w:r>
+        <w:rPr>
+          <w:b/>
+          <w:bCs/>
+          <w:lang w:val="en-US"/>
+        </w:rPr>
+        <w:t xml:space="preserve">extraction. Before transforming the window into the frequency </w:t>
+      </w:r>
+      <w:proofErr w:type="gramStart"/>
+      <w:r>
+        <w:rPr>
+          <w:b/>
+          <w:bCs/>
+          <w:lang w:val="en-US"/>
+        </w:rPr>
+        <w:t>domain</w:t>
+      </w:r>
+      <w:proofErr w:type="gramEnd"/>
+      <w:r>
+        <w:rPr>
+          <w:b/>
+          <w:bCs/>
+          <w:lang w:val="en-US"/>
+        </w:rPr>
+        <w:t xml:space="preserve"> you should do some</w:t>
+      </w:r>
+    </w:p>
+    <w:p>
+      <w:pPr>
+        <w:rPr>
+          <w:b/>
+          <w:bCs/>
+          <w:lang w:val="en-US"/>
+        </w:rPr>
+      </w:pPr>
+      <w:r>
+        <w:rPr>
+          <w:b/>
+          <w:bCs/>
+          <w:lang w:val="en-US"/>
+        </w:rPr>
+        <w:t xml:space="preserve">preprocessing for the 10 s window (e.g. </w:t>
+      </w:r>
+      <w:proofErr w:type="spellStart"/>
+      <w:r>
+        <w:rPr>
+          <w:b/>
+          <w:bCs/>
+          <w:lang w:val="en-US"/>
+        </w:rPr>
+        <w:t>highpass</w:t>
+      </w:r>
+      <w:proofErr w:type="spellEnd"/>
+      <w:r>
+        <w:rPr>
+          <w:b/>
+          <w:bCs/>
+          <w:lang w:val="en-US"/>
+        </w:rPr>
+        <w:t xml:space="preserve"> filtering at a meaningful frequency (e.g. using</w:t>
+      </w:r>
+    </w:p>
+    <w:p>
+      <w:pPr>
+        <w:rPr>
+          <w:b/>
+          <w:bCs/>
+          <w:lang w:val="en-US"/>
+        </w:rPr>
+      </w:pPr>
+      <w:r>
+        <w:rPr>
+          <w:b/>
+          <w:bCs/>
+          <w:lang w:val="en-US"/>
+        </w:rPr>
+        <w:t xml:space="preserve">for </w:t>
+      </w:r>
+      <w:proofErr w:type="gramStart"/>
+      <w:r>
+        <w:rPr>
+          <w:b/>
+          <w:bCs/>
+          <w:lang w:val="en-US"/>
+        </w:rPr>
+        <w:t>example</w:t>
+      </w:r>
+      <w:proofErr w:type="gramEnd"/>
+      <w:r>
+        <w:rPr>
+          <w:b/>
+          <w:bCs/>
+          <w:lang w:val="en-US"/>
+        </w:rPr>
+        <w:t xml:space="preserve"> </w:t>
+      </w:r>
+      <w:proofErr w:type="spellStart"/>
+      <w:r>
+        <w:rPr>
+          <w:b/>
+          <w:bCs/>
+          <w:lang w:val="en-US"/>
+        </w:rPr>
+        <w:t>butterworth</w:t>
+      </w:r>
+      <w:proofErr w:type="spellEnd"/>
+      <w:r>
+        <w:rPr>
+          <w:b/>
+          <w:bCs/>
+          <w:lang w:val="en-US"/>
+        </w:rPr>
+        <w:t>) or detrending). Then find a way to algorithmically detect the heart rate</w:t>
       </w:r>
     </w:p>
     <w:p>
@@ -4013,24 +4597,60 @@
           <w:bCs/>
           <w:lang w:val="en-US"/>
         </w:rPr>
-        <w:t>error (MAE) and the Pearson correlation coefficient (only using numpy for both!) of the</w:t>
-      </w:r>
-    </w:p>
-    <w:p>
-      <w:pPr>
-        <w:rPr>
-          <w:b/>
-          <w:bCs/>
-          <w:lang w:val="en-US"/>
-        </w:rPr>
-      </w:pPr>
-      <w:r>
-        <w:rPr>
-          <w:b/>
-          <w:bCs/>
-          <w:lang w:val="en-US"/>
-        </w:rPr>
-        <w:t>smartwatch PPG HR with and without smoothing for all measurements (You have to do that</w:t>
+        <w:t xml:space="preserve">error (MAE) and the Pearson correlation coefficient (only using </w:t>
+      </w:r>
+      <w:proofErr w:type="spellStart"/>
+      <w:r>
+        <w:rPr>
+          <w:b/>
+          <w:bCs/>
+          <w:lang w:val="en-US"/>
+        </w:rPr>
+        <w:t>numpy</w:t>
+      </w:r>
+      <w:proofErr w:type="spellEnd"/>
+      <w:r>
+        <w:rPr>
+          <w:b/>
+          <w:bCs/>
+          <w:lang w:val="en-US"/>
+        </w:rPr>
+        <w:t xml:space="preserve"> for both!) of the</w:t>
+      </w:r>
+    </w:p>
+    <w:p>
+      <w:pPr>
+        <w:rPr>
+          <w:b/>
+          <w:bCs/>
+          <w:lang w:val="en-US"/>
+        </w:rPr>
+      </w:pPr>
+      <w:r>
+        <w:rPr>
+          <w:b/>
+          <w:bCs/>
+          <w:lang w:val="en-US"/>
+        </w:rPr>
+        <w:t xml:space="preserve">smartwatch PPG HR with and without smoothing for all measurements (You </w:t>
+      </w:r>
+      <w:proofErr w:type="gramStart"/>
+      <w:r>
+        <w:rPr>
+          <w:b/>
+          <w:bCs/>
+          <w:lang w:val="en-US"/>
+        </w:rPr>
+        <w:t>have to</w:t>
+      </w:r>
+      <w:proofErr w:type="gramEnd"/>
+      <w:r>
+        <w:rPr>
+          <w:b/>
+          <w:bCs/>
+          <w:lang w:val="en-US"/>
+        </w:rPr>
+        <w:t xml:space="preserve"> do that</w:t>
       </w:r>
     </w:p>
     <w:p>
@@ -4149,7 +4769,25 @@
           <w:bCs/>
           <w:lang w:val="en-US"/>
         </w:rPr>
-        <w:t>Repeat Q8 for the biopac PPG and discuss any differences.</w:t>
+        <w:t xml:space="preserve">Repeat Q8 for the </w:t>
+      </w:r>
+      <w:proofErr w:type="spellStart"/>
+      <w:r>
+        <w:rPr>
+          <w:b/>
+          <w:bCs/>
+          <w:lang w:val="en-US"/>
+        </w:rPr>
+        <w:t>biopac</w:t>
+      </w:r>
+      <w:proofErr w:type="spellEnd"/>
+      <w:r>
+        <w:rPr>
+          <w:b/>
+          <w:bCs/>
+          <w:lang w:val="en-US"/>
+        </w:rPr>
+        <w:t xml:space="preserve"> PPG and discuss any differences.</w:t>
       </w:r>
     </w:p>
     <w:p>
@@ -6799,6 +7437,7 @@
         </w:rPr>
         <w:t xml:space="preserve">: Measurements of </w:t>
       </w:r>
+      <w:proofErr w:type="spellStart"/>
       <w:r>
         <w:rPr>
           <w:color w:val="7F7F7F" w:themeColor="text1" w:themeTint="80"/>
@@ -6806,6 +7445,7 @@
         </w:rPr>
         <w:t>BioPac</w:t>
       </w:r>
+      <w:proofErr w:type="spellEnd"/>
       <w:r>
         <w:rPr>
           <w:color w:val="7F7F7F" w:themeColor="text1" w:themeTint="80"/>
@@ -10941,7 +11581,25 @@
           <w:bCs/>
           <w:lang w:val="en-US"/>
         </w:rPr>
-        <w:t>ground truth. Plot the biopac PPG heart rate with the ground truth as a Bland Altmann plot for</w:t>
+        <w:t xml:space="preserve">ground truth. Plot the </w:t>
+      </w:r>
+      <w:proofErr w:type="spellStart"/>
+      <w:r>
+        <w:rPr>
+          <w:b/>
+          <w:bCs/>
+          <w:lang w:val="en-US"/>
+        </w:rPr>
+        <w:t>biopac</w:t>
+      </w:r>
+      <w:proofErr w:type="spellEnd"/>
+      <w:r>
+        <w:rPr>
+          <w:b/>
+          <w:bCs/>
+          <w:lang w:val="en-US"/>
+        </w:rPr>
+        <w:t xml:space="preserve"> PPG heart rate with the ground truth as a Bland Altmann plot for</w:t>
       </w:r>
     </w:p>
     <w:p>
@@ -10959,24 +11617,60 @@
           <w:lang w:val="en-US"/>
         </w:rPr>
         <w:lastRenderedPageBreak/>
-        <w:t>both smoothed and not smoothed heart rate and also for “Stairs” and “Workout” data (you can</w:t>
-      </w:r>
-    </w:p>
-    <w:p>
-      <w:pPr>
-        <w:rPr>
-          <w:b/>
-          <w:bCs/>
-          <w:lang w:val="en-US"/>
-        </w:rPr>
-      </w:pPr>
-      <w:r>
-        <w:rPr>
-          <w:b/>
-          <w:bCs/>
-          <w:lang w:val="en-US"/>
-        </w:rPr>
-        <w:t>choose one measurement, but document which one).</w:t>
+        <w:t xml:space="preserve">both smoothed and not smoothed heart rate </w:t>
+      </w:r>
+      <w:proofErr w:type="gramStart"/>
+      <w:r>
+        <w:rPr>
+          <w:b/>
+          <w:bCs/>
+          <w:lang w:val="en-US"/>
+        </w:rPr>
+        <w:t>and also</w:t>
+      </w:r>
+      <w:proofErr w:type="gramEnd"/>
+      <w:r>
+        <w:rPr>
+          <w:b/>
+          <w:bCs/>
+          <w:lang w:val="en-US"/>
+        </w:rPr>
+        <w:t xml:space="preserve"> for “Stairs” and “Workout” data (you can</w:t>
+      </w:r>
+    </w:p>
+    <w:p>
+      <w:pPr>
+        <w:rPr>
+          <w:b/>
+          <w:bCs/>
+          <w:lang w:val="en-US"/>
+        </w:rPr>
+      </w:pPr>
+      <w:r>
+        <w:rPr>
+          <w:b/>
+          <w:bCs/>
+          <w:lang w:val="en-US"/>
+        </w:rPr>
+        <w:t xml:space="preserve">choose one </w:t>
+      </w:r>
+      <w:proofErr w:type="gramStart"/>
+      <w:r>
+        <w:rPr>
+          <w:b/>
+          <w:bCs/>
+          <w:lang w:val="en-US"/>
+        </w:rPr>
+        <w:t>measurement, but</w:t>
+      </w:r>
+      <w:proofErr w:type="gramEnd"/>
+      <w:r>
+        <w:rPr>
+          <w:b/>
+          <w:bCs/>
+          <w:lang w:val="en-US"/>
+        </w:rPr>
+        <w:t xml:space="preserve"> document which one).</w:t>
       </w:r>
     </w:p>
     <w:p>
@@ -11010,41 +11704,95 @@
           <w:bCs/>
           <w:lang w:val="en-US"/>
         </w:rPr>
-        <w:t>smoothed and not smoothed heart rate and also for “Stairs” and “Workout” data (you can</w:t>
-      </w:r>
-    </w:p>
-    <w:p>
-      <w:pPr>
-        <w:rPr>
-          <w:b/>
-          <w:bCs/>
-          <w:lang w:val="en-US"/>
-        </w:rPr>
-      </w:pPr>
-      <w:r>
-        <w:rPr>
-          <w:b/>
-          <w:bCs/>
-          <w:lang w:val="en-US"/>
-        </w:rPr>
-        <w:t>choose one measurement, but document which one).</w:t>
-      </w:r>
-    </w:p>
-    <w:p>
-      <w:pPr>
-        <w:rPr>
-          <w:b/>
-          <w:bCs/>
-          <w:lang w:val="en-US"/>
-        </w:rPr>
-      </w:pPr>
-      <w:r>
-        <w:rPr>
-          <w:b/>
-          <w:bCs/>
-          <w:lang w:val="en-US"/>
-        </w:rPr>
-        <w:t>Also do a Bland Altmann plot on the frequency based heart rate extraction.</w:t>
+        <w:t xml:space="preserve">smoothed and not smoothed heart rate </w:t>
+      </w:r>
+      <w:proofErr w:type="gramStart"/>
+      <w:r>
+        <w:rPr>
+          <w:b/>
+          <w:bCs/>
+          <w:lang w:val="en-US"/>
+        </w:rPr>
+        <w:t>and also</w:t>
+      </w:r>
+      <w:proofErr w:type="gramEnd"/>
+      <w:r>
+        <w:rPr>
+          <w:b/>
+          <w:bCs/>
+          <w:lang w:val="en-US"/>
+        </w:rPr>
+        <w:t xml:space="preserve"> for “Stairs” and “Workout” data (you can</w:t>
+      </w:r>
+    </w:p>
+    <w:p>
+      <w:pPr>
+        <w:rPr>
+          <w:b/>
+          <w:bCs/>
+          <w:lang w:val="en-US"/>
+        </w:rPr>
+      </w:pPr>
+      <w:r>
+        <w:rPr>
+          <w:b/>
+          <w:bCs/>
+          <w:lang w:val="en-US"/>
+        </w:rPr>
+        <w:t xml:space="preserve">choose one </w:t>
+      </w:r>
+      <w:proofErr w:type="gramStart"/>
+      <w:r>
+        <w:rPr>
+          <w:b/>
+          <w:bCs/>
+          <w:lang w:val="en-US"/>
+        </w:rPr>
+        <w:t>measurement, but</w:t>
+      </w:r>
+      <w:proofErr w:type="gramEnd"/>
+      <w:r>
+        <w:rPr>
+          <w:b/>
+          <w:bCs/>
+          <w:lang w:val="en-US"/>
+        </w:rPr>
+        <w:t xml:space="preserve"> document which one).</w:t>
+      </w:r>
+    </w:p>
+    <w:p>
+      <w:pPr>
+        <w:rPr>
+          <w:b/>
+          <w:bCs/>
+          <w:lang w:val="en-US"/>
+        </w:rPr>
+      </w:pPr>
+      <w:r>
+        <w:rPr>
+          <w:b/>
+          <w:bCs/>
+          <w:lang w:val="en-US"/>
+        </w:rPr>
+        <w:t xml:space="preserve">Also do a Bland Altmann plot on the </w:t>
+      </w:r>
+      <w:proofErr w:type="gramStart"/>
+      <w:r>
+        <w:rPr>
+          <w:b/>
+          <w:bCs/>
+          <w:lang w:val="en-US"/>
+        </w:rPr>
+        <w:t>frequency based</w:t>
+      </w:r>
+      <w:proofErr w:type="gramEnd"/>
+      <w:r>
+        <w:rPr>
+          <w:b/>
+          <w:bCs/>
+          <w:lang w:val="en-US"/>
+        </w:rPr>
+        <w:t xml:space="preserve"> heart rate extraction.</w:t>
       </w:r>
     </w:p>
     <w:p>
@@ -11168,7 +11916,21 @@
         <w:rPr>
           <w:lang w:val="en-US"/>
         </w:rPr>
-        <w:t xml:space="preserve"> and potential trends in measurement error across the measurement range. In the Biopac PPG “Workout” smoothed data vs ECG ground truth plot, most points cluster around the bias line with random scatter, suggesting reasonable agreement but some systematic </w:t>
+        <w:t xml:space="preserve"> and potential trends in measurement error across the measurement range. In the </w:t>
+      </w:r>
+      <w:proofErr w:type="spellStart"/>
+      <w:r>
+        <w:rPr>
+          <w:lang w:val="en-US"/>
+        </w:rPr>
+        <w:t>Biopac</w:t>
+      </w:r>
+      <w:proofErr w:type="spellEnd"/>
+      <w:r>
+        <w:rPr>
+          <w:lang w:val="en-US"/>
+        </w:rPr>
+        <w:t xml:space="preserve"> PPG “Workout” smoothed data vs ECG ground truth plot, most points cluster around the bias line with random scatter, suggesting reasonable agreement but some systematic </w:t>
       </w:r>
       <w:r>
         <w:rPr>
@@ -11204,7 +11966,21 @@
         <w:rPr>
           <w:lang w:val="en-US"/>
         </w:rPr>
-        <w:t>. The limits of agreement indicate the expected range of differences between methods. This helps assess both accuracy (bias) and precision (spread). In this context, it shows how reliable the Biopac PPG</w:t>
+        <w:t xml:space="preserve">. The limits of agreement indicate the expected range of differences between methods. This helps assess both accuracy (bias) and precision (spread). In this context, it shows how reliable the </w:t>
+      </w:r>
+      <w:proofErr w:type="spellStart"/>
+      <w:r>
+        <w:rPr>
+          <w:lang w:val="en-US"/>
+        </w:rPr>
+        <w:t>Biopac</w:t>
+      </w:r>
+      <w:proofErr w:type="spellEnd"/>
+      <w:r>
+        <w:rPr>
+          <w:lang w:val="en-US"/>
+        </w:rPr>
+        <w:t xml:space="preserve"> PPG</w:t>
       </w:r>
       <w:r>
         <w:rPr>
@@ -11234,7 +12010,49 @@
         <w:rPr>
           <w:lang w:val="en-US"/>
         </w:rPr>
-        <w:t xml:space="preserve">Based on the Bland-Altman plots you can see that the BioPac PPG Based HR Data seems to work better than the data generated out of the smartwatch ppg curve. However, this might be due to the BP ECG Data being used as the ground truth. All in all though, the different BP and SmartWatch Plots show that the mean difference is in a lot of datapoints around 0 (while the random scatter is mostly in the positive), which suggests that the differ methods have a low bias and a relatively low spread. On the other hand, the frequency-based HR extraction seems to not work very well (seen by the extremely high differences in the last two plots), the values have almost nothing in common with the selected ground truth and therefore show that this method did not work as well as hoped. </w:t>
+        <w:t xml:space="preserve">Based on the Bland-Altman plots you can see that the </w:t>
+      </w:r>
+      <w:proofErr w:type="spellStart"/>
+      <w:r>
+        <w:rPr>
+          <w:lang w:val="en-US"/>
+        </w:rPr>
+        <w:t>BioPac</w:t>
+      </w:r>
+      <w:proofErr w:type="spellEnd"/>
+      <w:r>
+        <w:rPr>
+          <w:lang w:val="en-US"/>
+        </w:rPr>
+        <w:t xml:space="preserve"> PPG Based HR Data seems to work better than the data generated out of the smartwatch ppg curve. However, this might be due to the BP ECG Data being used as the ground truth. All in </w:t>
+      </w:r>
+      <w:proofErr w:type="gramStart"/>
+      <w:r>
+        <w:rPr>
+          <w:lang w:val="en-US"/>
+        </w:rPr>
+        <w:t>all</w:t>
+      </w:r>
+      <w:proofErr w:type="gramEnd"/>
+      <w:r>
+        <w:rPr>
+          <w:lang w:val="en-US"/>
+        </w:rPr>
+        <w:t xml:space="preserve"> though, the different BP and </w:t>
+      </w:r>
+      <w:proofErr w:type="spellStart"/>
+      <w:r>
+        <w:rPr>
+          <w:lang w:val="en-US"/>
+        </w:rPr>
+        <w:t>SmartWatch</w:t>
+      </w:r>
+      <w:proofErr w:type="spellEnd"/>
+      <w:r>
+        <w:rPr>
+          <w:lang w:val="en-US"/>
+        </w:rPr>
+        <w:t xml:space="preserve"> Plots show that the mean difference is in a lot of datapoints around 0 (while the random scatter is mostly in the positive), which suggests that the differ methods have a low bias and a relatively low spread. On the other hand, the frequency-based HR extraction seems to not work very well (seen by the extremely high differences in the last two plots), the values have almost nothing in common with the selected ground truth and therefore show that this method did not work as well as hoped. </w:t>
       </w:r>
     </w:p>
     <w:p>
@@ -11328,7 +12146,23 @@
           <w:color w:val="7F7F7F" w:themeColor="text1" w:themeTint="80"/>
           <w:lang w:val="en-US"/>
         </w:rPr>
-        <w:t xml:space="preserve">Bland-Altman plot of instant heartrate from BioPac ECG (ground truth) against </w:t>
+        <w:t xml:space="preserve">Bland-Altman plot of instant heartrate from </w:t>
+      </w:r>
+      <w:proofErr w:type="spellStart"/>
+      <w:r>
+        <w:rPr>
+          <w:color w:val="7F7F7F" w:themeColor="text1" w:themeTint="80"/>
+          <w:lang w:val="en-US"/>
+        </w:rPr>
+        <w:t>BioPac</w:t>
+      </w:r>
+      <w:proofErr w:type="spellEnd"/>
+      <w:r>
+        <w:rPr>
+          <w:color w:val="7F7F7F" w:themeColor="text1" w:themeTint="80"/>
+          <w:lang w:val="en-US"/>
+        </w:rPr>
+        <w:t xml:space="preserve"> ECG (ground truth) against </w:t>
       </w:r>
       <w:r>
         <w:rPr>
@@ -11337,12 +12171,21 @@
         </w:rPr>
         <w:t xml:space="preserve">instant heart rate from </w:t>
       </w:r>
-      <w:r>
-        <w:rPr>
-          <w:color w:val="7F7F7F" w:themeColor="text1" w:themeTint="80"/>
-          <w:lang w:val="en-US"/>
-        </w:rPr>
-        <w:t>BioPac PPG</w:t>
+      <w:proofErr w:type="spellStart"/>
+      <w:r>
+        <w:rPr>
+          <w:color w:val="7F7F7F" w:themeColor="text1" w:themeTint="80"/>
+          <w:lang w:val="en-US"/>
+        </w:rPr>
+        <w:t>BioPac</w:t>
+      </w:r>
+      <w:proofErr w:type="spellEnd"/>
+      <w:r>
+        <w:rPr>
+          <w:color w:val="7F7F7F" w:themeColor="text1" w:themeTint="80"/>
+          <w:lang w:val="en-US"/>
+        </w:rPr>
+        <w:t xml:space="preserve"> PPG</w:t>
       </w:r>
     </w:p>
     <w:p>
@@ -11460,7 +12303,23 @@
           <w:color w:val="7F7F7F" w:themeColor="text1" w:themeTint="80"/>
           <w:lang w:val="en-US"/>
         </w:rPr>
-        <w:t xml:space="preserve"> heartrate from BioPac ECG (ground truth) against </w:t>
+        <w:t xml:space="preserve"> heartrate from </w:t>
+      </w:r>
+      <w:proofErr w:type="spellStart"/>
+      <w:r>
+        <w:rPr>
+          <w:color w:val="7F7F7F" w:themeColor="text1" w:themeTint="80"/>
+          <w:lang w:val="en-US"/>
+        </w:rPr>
+        <w:t>BioPac</w:t>
+      </w:r>
+      <w:proofErr w:type="spellEnd"/>
+      <w:r>
+        <w:rPr>
+          <w:color w:val="7F7F7F" w:themeColor="text1" w:themeTint="80"/>
+          <w:lang w:val="en-US"/>
+        </w:rPr>
+        <w:t xml:space="preserve"> ECG (ground truth) against </w:t>
       </w:r>
       <w:r>
         <w:rPr>
@@ -11474,7 +12333,23 @@
           <w:color w:val="7F7F7F" w:themeColor="text1" w:themeTint="80"/>
           <w:lang w:val="en-US"/>
         </w:rPr>
-        <w:t xml:space="preserve"> heart rate from BioPac PPG</w:t>
+        <w:t xml:space="preserve"> heart rate from </w:t>
+      </w:r>
+      <w:proofErr w:type="spellStart"/>
+      <w:r>
+        <w:rPr>
+          <w:color w:val="7F7F7F" w:themeColor="text1" w:themeTint="80"/>
+          <w:lang w:val="en-US"/>
+        </w:rPr>
+        <w:t>BioPac</w:t>
+      </w:r>
+      <w:proofErr w:type="spellEnd"/>
+      <w:r>
+        <w:rPr>
+          <w:color w:val="7F7F7F" w:themeColor="text1" w:themeTint="80"/>
+          <w:lang w:val="en-US"/>
+        </w:rPr>
+        <w:t xml:space="preserve"> PPG</w:t>
       </w:r>
     </w:p>
     <w:p>
@@ -11589,7 +12464,23 @@
           <w:color w:val="7F7F7F" w:themeColor="text1" w:themeTint="80"/>
           <w:lang w:val="en-US"/>
         </w:rPr>
-        <w:t xml:space="preserve"> heartrate from BioPac ECG (ground truth) against </w:t>
+        <w:t xml:space="preserve"> heartrate from </w:t>
+      </w:r>
+      <w:proofErr w:type="spellStart"/>
+      <w:r>
+        <w:rPr>
+          <w:color w:val="7F7F7F" w:themeColor="text1" w:themeTint="80"/>
+          <w:lang w:val="en-US"/>
+        </w:rPr>
+        <w:t>BioPac</w:t>
+      </w:r>
+      <w:proofErr w:type="spellEnd"/>
+      <w:r>
+        <w:rPr>
+          <w:color w:val="7F7F7F" w:themeColor="text1" w:themeTint="80"/>
+          <w:lang w:val="en-US"/>
+        </w:rPr>
+        <w:t xml:space="preserve"> ECG (ground truth) against </w:t>
       </w:r>
       <w:r>
         <w:rPr>
@@ -11735,7 +12626,23 @@
           <w:color w:val="7F7F7F" w:themeColor="text1" w:themeTint="80"/>
           <w:lang w:val="en-US"/>
         </w:rPr>
-        <w:t xml:space="preserve"> heartrate from BioPac ECG (ground truth) against </w:t>
+        <w:t xml:space="preserve"> heartrate from </w:t>
+      </w:r>
+      <w:proofErr w:type="spellStart"/>
+      <w:r>
+        <w:rPr>
+          <w:color w:val="7F7F7F" w:themeColor="text1" w:themeTint="80"/>
+          <w:lang w:val="en-US"/>
+        </w:rPr>
+        <w:t>BioPac</w:t>
+      </w:r>
+      <w:proofErr w:type="spellEnd"/>
+      <w:r>
+        <w:rPr>
+          <w:color w:val="7F7F7F" w:themeColor="text1" w:themeTint="80"/>
+          <w:lang w:val="en-US"/>
+        </w:rPr>
+        <w:t xml:space="preserve"> ECG (ground truth) against </w:t>
       </w:r>
       <w:r>
         <w:rPr>
@@ -11852,14 +12759,39 @@
           <w:color w:val="7F7F7F" w:themeColor="text1" w:themeTint="80"/>
           <w:lang w:val="en-US"/>
         </w:rPr>
-        <w:t xml:space="preserve">Bland-Altman plot of smoothed heartrate from BioPac ECG (ground truth) against </w:t>
-      </w:r>
-      <w:r>
-        <w:rPr>
-          <w:color w:val="7F7F7F" w:themeColor="text1" w:themeTint="80"/>
-          <w:lang w:val="en-US"/>
-        </w:rPr>
-        <w:t>frequency based heartrate calculated from smartwatch data</w:t>
+        <w:t xml:space="preserve">Bland-Altman plot of smoothed heartrate from </w:t>
+      </w:r>
+      <w:proofErr w:type="spellStart"/>
+      <w:r>
+        <w:rPr>
+          <w:color w:val="7F7F7F" w:themeColor="text1" w:themeTint="80"/>
+          <w:lang w:val="en-US"/>
+        </w:rPr>
+        <w:t>BioPac</w:t>
+      </w:r>
+      <w:proofErr w:type="spellEnd"/>
+      <w:r>
+        <w:rPr>
+          <w:color w:val="7F7F7F" w:themeColor="text1" w:themeTint="80"/>
+          <w:lang w:val="en-US"/>
+        </w:rPr>
+        <w:t xml:space="preserve"> ECG (ground truth) against </w:t>
+      </w:r>
+      <w:proofErr w:type="gramStart"/>
+      <w:r>
+        <w:rPr>
+          <w:color w:val="7F7F7F" w:themeColor="text1" w:themeTint="80"/>
+          <w:lang w:val="en-US"/>
+        </w:rPr>
+        <w:t>frequency based</w:t>
+      </w:r>
+      <w:proofErr w:type="gramEnd"/>
+      <w:r>
+        <w:rPr>
+          <w:color w:val="7F7F7F" w:themeColor="text1" w:themeTint="80"/>
+          <w:lang w:val="en-US"/>
+        </w:rPr>
+        <w:t xml:space="preserve"> heartrate calculated from smartwatch data</w:t>
       </w:r>
     </w:p>
     <w:p>
@@ -15256,7 +16188,6 @@
     <w:rsid w:val="001D4425"/>
     <w:rsid w:val="001E1193"/>
     <w:rsid w:val="001F7831"/>
-    <w:rsid w:val="00277FB8"/>
     <w:rsid w:val="00390A6A"/>
     <w:rsid w:val="00421665"/>
     <w:rsid w:val="004D7FBC"/>
@@ -15277,6 +16208,7 @@
     <w:rsid w:val="00B77025"/>
     <w:rsid w:val="00C04012"/>
     <w:rsid w:val="00C46E4C"/>
+    <w:rsid w:val="00CD2454"/>
     <w:rsid w:val="00D76533"/>
     <w:rsid w:val="00DE4AC7"/>
     <w:rsid w:val="00E36E2A"/>

</xml_diff>